<commit_message>
added some planning to the MZ chapter
</commit_message>
<xml_diff>
--- a/Structuring photodiode chapter.docx
+++ b/Structuring photodiode chapter.docx
@@ -22,15 +22,28 @@
         </w:numPr>
       </w:pPr>
       <w:r>
-        <w:t xml:space="preserve">Set the scene: cryogenic -&gt; 2um -&gt; extended </w:t>
-      </w:r>
-      <w:proofErr w:type="spellStart"/>
-      <w:r>
-        <w:t>InGaAs</w:t>
-      </w:r>
-      <w:proofErr w:type="spellEnd"/>
+        <w:t>Set the scene: cryogenic -&gt; 2um -&gt; extended InGaAs</w:t>
+      </w:r>
+      <w:r>
+        <w:t xml:space="preserve"> +</w:t>
+      </w:r>
+      <w:r>
+        <w:t xml:space="preserve"> </w:t>
+      </w:r>
+      <w:r>
+        <w:t>InSb</w:t>
+      </w:r>
       <w:r>
         <w:t>?</w:t>
+      </w:r>
+      <w:r>
+        <w:t xml:space="preserve"> N.B. </w:t>
+      </w:r>
+      <w:r>
+        <w:t>avoid tunnel vision</w:t>
+      </w:r>
+      <w:r>
+        <w:t>, mention MCT.</w:t>
       </w:r>
     </w:p>
     <w:p>
@@ -74,21 +87,8 @@
     </w:p>
     <w:p>
       <w:r>
-        <w:t xml:space="preserve">What is an extended </w:t>
-      </w:r>
-      <w:proofErr w:type="spellStart"/>
-      <w:r>
-        <w:t>InGaAs</w:t>
-      </w:r>
-      <w:proofErr w:type="spellEnd"/>
-      <w:r>
-        <w:t xml:space="preserve"> </w:t>
-      </w:r>
-      <w:proofErr w:type="gramStart"/>
-      <w:r>
-        <w:t>photodiode:</w:t>
-      </w:r>
-      <w:proofErr w:type="gramEnd"/>
+        <w:t>What is an extended InGaAs photodiode:</w:t>
+      </w:r>
     </w:p>
     <w:p>
       <w:pPr>
@@ -128,26 +128,16 @@
       <w:r>
         <w:t xml:space="preserve"> to see if this problem </w:t>
       </w:r>
-      <w:proofErr w:type="gramStart"/>
-      <w:r>
-        <w:t>exist</w:t>
-      </w:r>
-      <w:proofErr w:type="gramEnd"/>
+      <w:r>
+        <w:t>exists</w:t>
+      </w:r>
       <w:r>
         <w:t xml:space="preserve"> in commercial PDs</w:t>
       </w:r>
     </w:p>
     <w:p>
       <w:r>
-        <w:t xml:space="preserve">‘What is needed from a photodiode in a </w:t>
-      </w:r>
-      <w:proofErr w:type="spellStart"/>
-      <w:r>
-        <w:t>gw</w:t>
-      </w:r>
-      <w:proofErr w:type="spellEnd"/>
-      <w:r>
-        <w:t xml:space="preserve"> detector?’ section:</w:t>
+        <w:t>‘What is needed from a photodiode in a gw detector?’ section:</w:t>
       </w:r>
     </w:p>
     <w:p>
@@ -212,15 +202,7 @@
         <w:pStyle w:val="ListParagraph"/>
       </w:pPr>
       <w:r>
-        <w:t xml:space="preserve">This means we have to do &lt;list </w:t>
-      </w:r>
-      <w:proofErr w:type="gramStart"/>
-      <w:r>
-        <w:t>of  measurements</w:t>
-      </w:r>
-      <w:proofErr w:type="gramEnd"/>
-      <w:r>
-        <w:t xml:space="preserve"> that will be mentioned in chapter&gt;</w:t>
+        <w:t>This means we have to do &lt;list of  measurements that will be mentioned in chapter&gt;</w:t>
       </w:r>
     </w:p>
     <w:p>
@@ -274,22 +256,11 @@
         <w:pStyle w:val="ListParagraph"/>
         <w:numPr>
           <w:ilvl w:val="0"/>
-          <w:numId w:val="7"/>
+          <w:numId w:val="8"/>
         </w:numPr>
       </w:pPr>
       <w:r>
-        <w:t xml:space="preserve">Shot noise measurement: real increase in QE. </w:t>
-      </w:r>
-    </w:p>
-    <w:p>
-      <w:r>
-        <w:t>Linearity/</w:t>
-      </w:r>
-      <w:r>
-        <w:t>Saturation experiment</w:t>
-      </w:r>
-      <w:r>
-        <w:t xml:space="preserve"> + result and discussion</w:t>
+        <w:t>QE was measured for diodes that were linear…</w:t>
       </w:r>
     </w:p>
     <w:p>
@@ -301,12 +272,44 @@
         </w:numPr>
       </w:pPr>
       <w:r>
+        <w:t xml:space="preserve">Shot noise measurement: real increase in QE. </w:t>
+      </w:r>
+    </w:p>
+    <w:p>
+      <w:r>
+        <w:t>Linearity/</w:t>
+      </w:r>
+      <w:r>
+        <w:t>Saturation experiment + result and discussion</w:t>
+      </w:r>
+    </w:p>
+    <w:p>
+      <w:pPr>
+        <w:pStyle w:val="ListParagraph"/>
+        <w:numPr>
+          <w:ilvl w:val="0"/>
+          <w:numId w:val="7"/>
+        </w:numPr>
+      </w:pPr>
+      <w:r>
         <w:t>AC to DC ratio measurement.</w:t>
       </w:r>
     </w:p>
     <w:p>
       <w:r>
-        <w:t>Discussion of all results in context with each other:</w:t>
+        <w:t>Discussion of</w:t>
+      </w:r>
+      <w:r>
+        <w:t>,</w:t>
+      </w:r>
+      <w:r>
+        <w:t xml:space="preserve"> </w:t>
+      </w:r>
+      <w:r>
+        <w:t xml:space="preserve">where relevant, </w:t>
+      </w:r>
+      <w:r>
+        <w:t>results in context with each other:</w:t>
       </w:r>
     </w:p>
     <w:p>
@@ -346,6 +349,21 @@
       </w:r>
     </w:p>
     <w:p>
+      <w:pPr>
+        <w:pStyle w:val="ListParagraph"/>
+        <w:numPr>
+          <w:ilvl w:val="0"/>
+          <w:numId w:val="5"/>
+        </w:numPr>
+      </w:pPr>
+      <w:r>
+        <w:t>Table</w:t>
+      </w:r>
+      <w:r>
+        <w:t xml:space="preserve"> that sums up goodness of photodiodes. Explain overall trends. </w:t>
+      </w:r>
+    </w:p>
+    <w:p>
       <w:r>
         <w:t>Conclusion</w:t>
       </w:r>
@@ -359,15 +377,19 @@
         </w:numPr>
       </w:pPr>
       <w:r>
-        <w:t xml:space="preserve">To fix this problem, </w:t>
-      </w:r>
-      <w:proofErr w:type="spellStart"/>
-      <w:r>
-        <w:t>InGaAs</w:t>
-      </w:r>
-      <w:proofErr w:type="spellEnd"/>
-      <w:r>
-        <w:t xml:space="preserve"> needs to be grown slowly to avoid lattice defects which give rise to 1/f noise. Commercially available photodiodes are not made this way, it would take a large order to try this.</w:t>
+        <w:t xml:space="preserve">To fix this problem, InGaAs needs to be grown slowly to avoid lattice defects which give rise to 1/f noise. Commercially available photodiodes are not made this way, it would take a large </w:t>
+      </w:r>
+      <w:r>
+        <w:t xml:space="preserve">order </w:t>
+      </w:r>
+      <w:r>
+        <w:t>to try this.</w:t>
+      </w:r>
+      <w:r>
+        <w:t xml:space="preserve"> A manufacturer has proposed to commission of </w:t>
+      </w:r>
+      <w:r>
+        <w:t>wafers.</w:t>
       </w:r>
     </w:p>
     <w:sectPr>
@@ -722,6 +744,119 @@
     </w:lvl>
   </w:abstractNum>
   <w:abstractNum w:abstractNumId="3" w15:restartNumberingAfterBreak="0">
+    <w:nsid w:val="3D54105A"/>
+    <w:multiLevelType w:val="hybridMultilevel"/>
+    <w:tmpl w:val="FEB2A150"/>
+    <w:lvl w:ilvl="0" w:tplc="08090001">
+      <w:start w:val="1"/>
+      <w:numFmt w:val="bullet"/>
+      <w:lvlText w:val=""/>
+      <w:lvlJc w:val="left"/>
+      <w:pPr>
+        <w:ind w:left="720" w:hanging="360"/>
+      </w:pPr>
+      <w:rPr>
+        <w:rFonts w:ascii="Symbol" w:hAnsi="Symbol" w:hint="default"/>
+      </w:rPr>
+    </w:lvl>
+    <w:lvl w:ilvl="1" w:tplc="08090003" w:tentative="1">
+      <w:start w:val="1"/>
+      <w:numFmt w:val="bullet"/>
+      <w:lvlText w:val="o"/>
+      <w:lvlJc w:val="left"/>
+      <w:pPr>
+        <w:ind w:left="1440" w:hanging="360"/>
+      </w:pPr>
+      <w:rPr>
+        <w:rFonts w:ascii="Courier New" w:hAnsi="Courier New" w:cs="Courier New" w:hint="default"/>
+      </w:rPr>
+    </w:lvl>
+    <w:lvl w:ilvl="2" w:tplc="08090005" w:tentative="1">
+      <w:start w:val="1"/>
+      <w:numFmt w:val="bullet"/>
+      <w:lvlText w:val=""/>
+      <w:lvlJc w:val="left"/>
+      <w:pPr>
+        <w:ind w:left="2160" w:hanging="360"/>
+      </w:pPr>
+      <w:rPr>
+        <w:rFonts w:ascii="Wingdings" w:hAnsi="Wingdings" w:hint="default"/>
+      </w:rPr>
+    </w:lvl>
+    <w:lvl w:ilvl="3" w:tplc="08090001" w:tentative="1">
+      <w:start w:val="1"/>
+      <w:numFmt w:val="bullet"/>
+      <w:lvlText w:val=""/>
+      <w:lvlJc w:val="left"/>
+      <w:pPr>
+        <w:ind w:left="2880" w:hanging="360"/>
+      </w:pPr>
+      <w:rPr>
+        <w:rFonts w:ascii="Symbol" w:hAnsi="Symbol" w:hint="default"/>
+      </w:rPr>
+    </w:lvl>
+    <w:lvl w:ilvl="4" w:tplc="08090003" w:tentative="1">
+      <w:start w:val="1"/>
+      <w:numFmt w:val="bullet"/>
+      <w:lvlText w:val="o"/>
+      <w:lvlJc w:val="left"/>
+      <w:pPr>
+        <w:ind w:left="3600" w:hanging="360"/>
+      </w:pPr>
+      <w:rPr>
+        <w:rFonts w:ascii="Courier New" w:hAnsi="Courier New" w:cs="Courier New" w:hint="default"/>
+      </w:rPr>
+    </w:lvl>
+    <w:lvl w:ilvl="5" w:tplc="08090005" w:tentative="1">
+      <w:start w:val="1"/>
+      <w:numFmt w:val="bullet"/>
+      <w:lvlText w:val=""/>
+      <w:lvlJc w:val="left"/>
+      <w:pPr>
+        <w:ind w:left="4320" w:hanging="360"/>
+      </w:pPr>
+      <w:rPr>
+        <w:rFonts w:ascii="Wingdings" w:hAnsi="Wingdings" w:hint="default"/>
+      </w:rPr>
+    </w:lvl>
+    <w:lvl w:ilvl="6" w:tplc="08090001" w:tentative="1">
+      <w:start w:val="1"/>
+      <w:numFmt w:val="bullet"/>
+      <w:lvlText w:val=""/>
+      <w:lvlJc w:val="left"/>
+      <w:pPr>
+        <w:ind w:left="5040" w:hanging="360"/>
+      </w:pPr>
+      <w:rPr>
+        <w:rFonts w:ascii="Symbol" w:hAnsi="Symbol" w:hint="default"/>
+      </w:rPr>
+    </w:lvl>
+    <w:lvl w:ilvl="7" w:tplc="08090003" w:tentative="1">
+      <w:start w:val="1"/>
+      <w:numFmt w:val="bullet"/>
+      <w:lvlText w:val="o"/>
+      <w:lvlJc w:val="left"/>
+      <w:pPr>
+        <w:ind w:left="5760" w:hanging="360"/>
+      </w:pPr>
+      <w:rPr>
+        <w:rFonts w:ascii="Courier New" w:hAnsi="Courier New" w:cs="Courier New" w:hint="default"/>
+      </w:rPr>
+    </w:lvl>
+    <w:lvl w:ilvl="8" w:tplc="08090005" w:tentative="1">
+      <w:start w:val="1"/>
+      <w:numFmt w:val="bullet"/>
+      <w:lvlText w:val=""/>
+      <w:lvlJc w:val="left"/>
+      <w:pPr>
+        <w:ind w:left="6480" w:hanging="360"/>
+      </w:pPr>
+      <w:rPr>
+        <w:rFonts w:ascii="Wingdings" w:hAnsi="Wingdings" w:hint="default"/>
+      </w:rPr>
+    </w:lvl>
+  </w:abstractNum>
+  <w:abstractNum w:abstractNumId="4" w15:restartNumberingAfterBreak="0">
     <w:nsid w:val="456042D8"/>
     <w:multiLevelType w:val="hybridMultilevel"/>
     <w:tmpl w:val="51B063B2"/>
@@ -834,7 +969,7 @@
       </w:rPr>
     </w:lvl>
   </w:abstractNum>
-  <w:abstractNum w:abstractNumId="4" w15:restartNumberingAfterBreak="0">
+  <w:abstractNum w:abstractNumId="5" w15:restartNumberingAfterBreak="0">
     <w:nsid w:val="55624F2D"/>
     <w:multiLevelType w:val="hybridMultilevel"/>
     <w:tmpl w:val="5AA29318"/>
@@ -947,7 +1082,7 @@
       </w:rPr>
     </w:lvl>
   </w:abstractNum>
-  <w:abstractNum w:abstractNumId="5" w15:restartNumberingAfterBreak="0">
+  <w:abstractNum w:abstractNumId="6" w15:restartNumberingAfterBreak="0">
     <w:nsid w:val="6C4F5F69"/>
     <w:multiLevelType w:val="hybridMultilevel"/>
     <w:tmpl w:val="15A2291C"/>
@@ -1060,7 +1195,7 @@
       </w:rPr>
     </w:lvl>
   </w:abstractNum>
-  <w:abstractNum w:abstractNumId="6" w15:restartNumberingAfterBreak="0">
+  <w:abstractNum w:abstractNumId="7" w15:restartNumberingAfterBreak="0">
     <w:nsid w:val="72226408"/>
     <w:multiLevelType w:val="hybridMultilevel"/>
     <w:tmpl w:val="B686A732"/>
@@ -1174,25 +1309,28 @@
     </w:lvl>
   </w:abstractNum>
   <w:num w:numId="1">
-    <w:abstractNumId w:val="5"/>
+    <w:abstractNumId w:val="6"/>
   </w:num>
   <w:num w:numId="2">
-    <w:abstractNumId w:val="6"/>
+    <w:abstractNumId w:val="7"/>
   </w:num>
   <w:num w:numId="3">
     <w:abstractNumId w:val="2"/>
   </w:num>
   <w:num w:numId="4">
-    <w:abstractNumId w:val="3"/>
+    <w:abstractNumId w:val="4"/>
   </w:num>
   <w:num w:numId="5">
-    <w:abstractNumId w:val="4"/>
+    <w:abstractNumId w:val="5"/>
   </w:num>
   <w:num w:numId="6">
     <w:abstractNumId w:val="1"/>
   </w:num>
   <w:num w:numId="7">
     <w:abstractNumId w:val="0"/>
+  </w:num>
+  <w:num w:numId="8">
+    <w:abstractNumId w:val="3"/>
   </w:num>
 </w:numbering>
 </file>
@@ -1320,6 +1458,7 @@
     <w:lsdException w:name="HTML Sample" w:semiHidden="1" w:unhideWhenUsed="1"/>
     <w:lsdException w:name="HTML Typewriter" w:semiHidden="1" w:unhideWhenUsed="1"/>
     <w:lsdException w:name="HTML Variable" w:semiHidden="1" w:unhideWhenUsed="1"/>
+    <w:lsdException w:name="Normal Table" w:semiHidden="1" w:unhideWhenUsed="1"/>
     <w:lsdException w:name="annotation subject" w:semiHidden="1" w:unhideWhenUsed="1"/>
     <w:lsdException w:name="No List" w:semiHidden="1" w:unhideWhenUsed="1"/>
     <w:lsdException w:name="Outline List 1" w:semiHidden="1" w:unhideWhenUsed="1"/>
@@ -1366,8 +1505,10 @@
     <w:lsdException w:name="Table Subtle 2" w:semiHidden="1" w:unhideWhenUsed="1"/>
     <w:lsdException w:name="Table Web 1" w:semiHidden="1" w:unhideWhenUsed="1"/>
     <w:lsdException w:name="Table Web 2" w:semiHidden="1" w:unhideWhenUsed="1"/>
+    <w:lsdException w:name="Table Web 3" w:semiHidden="1" w:unhideWhenUsed="1"/>
     <w:lsdException w:name="Balloon Text" w:semiHidden="1" w:unhideWhenUsed="1"/>
     <w:lsdException w:name="Table Grid" w:uiPriority="39"/>
+    <w:lsdException w:name="Table Theme" w:semiHidden="1" w:unhideWhenUsed="1"/>
     <w:lsdException w:name="Placeholder Text" w:semiHidden="1"/>
     <w:lsdException w:name="No Spacing" w:uiPriority="1" w:qFormat="1"/>
     <w:lsdException w:name="Light Shading" w:uiPriority="60"/>

</xml_diff>

<commit_message>
Adds figures to the photodiode chapter and adds structuring + words
adds the forward bias figures, the InSb figures
</commit_message>
<xml_diff>
--- a/Structuring photodiode chapter.docx
+++ b/Structuring photodiode chapter.docx
@@ -22,17 +22,24 @@
         </w:numPr>
       </w:pPr>
       <w:r>
-        <w:t>Set the scene: cryogenic -&gt; 2um -&gt; extended InGaAs</w:t>
-      </w:r>
+        <w:t xml:space="preserve">Set the scene: cryogenic -&gt; 2um -&gt; extended </w:t>
+      </w:r>
+      <w:proofErr w:type="spellStart"/>
+      <w:r>
+        <w:t>InGaAs</w:t>
+      </w:r>
+      <w:proofErr w:type="spellEnd"/>
       <w:r>
         <w:t xml:space="preserve"> +</w:t>
       </w:r>
       <w:r>
         <w:t xml:space="preserve"> </w:t>
       </w:r>
+      <w:proofErr w:type="spellStart"/>
       <w:r>
         <w:t>InSb</w:t>
       </w:r>
+      <w:proofErr w:type="spellEnd"/>
       <w:r>
         <w:t>?</w:t>
       </w:r>
@@ -87,8 +94,21 @@
     </w:p>
     <w:p>
       <w:r>
-        <w:t>What is an extended InGaAs photodiode:</w:t>
-      </w:r>
+        <w:t xml:space="preserve">What is an extended </w:t>
+      </w:r>
+      <w:proofErr w:type="spellStart"/>
+      <w:r>
+        <w:t>InGaAs</w:t>
+      </w:r>
+      <w:proofErr w:type="spellEnd"/>
+      <w:r>
+        <w:t xml:space="preserve"> </w:t>
+      </w:r>
+      <w:proofErr w:type="gramStart"/>
+      <w:r>
+        <w:t>photodiode:</w:t>
+      </w:r>
+      <w:proofErr w:type="gramEnd"/>
     </w:p>
     <w:p>
       <w:pPr>
@@ -137,7 +157,15 @@
     </w:p>
     <w:p>
       <w:r>
-        <w:t>‘What is needed from a photodiode in a gw detector?’ section:</w:t>
+        <w:t xml:space="preserve">‘What is needed from a photodiode in a </w:t>
+      </w:r>
+      <w:proofErr w:type="spellStart"/>
+      <w:r>
+        <w:t>gw</w:t>
+      </w:r>
+      <w:proofErr w:type="spellEnd"/>
+      <w:r>
+        <w:t xml:space="preserve"> detector?’ section:</w:t>
       </w:r>
     </w:p>
     <w:p>
@@ -194,7 +222,15 @@
         <w:t>Handle ~10mW of light</w:t>
       </w:r>
       <w:r>
-        <w:t xml:space="preserve"> i.e. linear</w:t>
+        <w:t xml:space="preserve"> </w:t>
+      </w:r>
+      <w:proofErr w:type="gramStart"/>
+      <w:r>
+        <w:t>i.e.</w:t>
+      </w:r>
+      <w:proofErr w:type="gramEnd"/>
+      <w:r>
+        <w:t xml:space="preserve"> linear</w:t>
       </w:r>
     </w:p>
     <w:p>
@@ -202,7 +238,15 @@
         <w:pStyle w:val="ListParagraph"/>
       </w:pPr>
       <w:r>
-        <w:t>This means we have to do &lt;list of  measurements that will be mentioned in chapter&gt;</w:t>
+        <w:t xml:space="preserve">This means we have to do &lt;list </w:t>
+      </w:r>
+      <w:proofErr w:type="gramStart"/>
+      <w:r>
+        <w:t>of  measurements</w:t>
+      </w:r>
+      <w:proofErr w:type="gramEnd"/>
+      <w:r>
+        <w:t xml:space="preserve"> that will be mentioned in chapter&gt;</w:t>
       </w:r>
     </w:p>
     <w:p>
@@ -377,7 +421,15 @@
         </w:numPr>
       </w:pPr>
       <w:r>
-        <w:t xml:space="preserve">To fix this problem, InGaAs needs to be grown slowly to avoid lattice defects which give rise to 1/f noise. Commercially available photodiodes are not made this way, it would take a large </w:t>
+        <w:t xml:space="preserve">To fix this problem, </w:t>
+      </w:r>
+      <w:proofErr w:type="spellStart"/>
+      <w:r>
+        <w:t>InGaAs</w:t>
+      </w:r>
+      <w:proofErr w:type="spellEnd"/>
+      <w:r>
+        <w:t xml:space="preserve"> needs to be grown slowly to avoid lattice defects which give rise to 1/f noise. Commercially available photodiodes are not made this way, it would take a large </w:t>
       </w:r>
       <w:r>
         <w:t xml:space="preserve">order </w:t>
@@ -390,6 +442,910 @@
       </w:r>
       <w:r>
         <w:t>wafers.</w:t>
+      </w:r>
+    </w:p>
+    <w:p/>
+    <w:p>
+      <w:r>
+        <w:lastRenderedPageBreak/>
+        <w:t>So far…</w:t>
+      </w:r>
+    </w:p>
+    <w:p/>
+    <w:p>
+      <w:pPr>
+        <w:rPr>
+          <w:b/>
+          <w:bCs/>
+        </w:rPr>
+      </w:pPr>
+      <w:r>
+        <w:rPr>
+          <w:b/>
+          <w:bCs/>
+        </w:rPr>
+        <w:t>Introduction</w:t>
+      </w:r>
+    </w:p>
+    <w:p>
+      <w:r>
+        <w:t xml:space="preserve">The current generation of gravitational will be limited by the thermal noise due to </w:t>
+      </w:r>
+      <w:proofErr w:type="spellStart"/>
+      <w:r>
+        <w:t>brownian</w:t>
+      </w:r>
+      <w:proofErr w:type="spellEnd"/>
+      <w:r>
+        <w:t xml:space="preserve"> motion of the molecules that make up the mirror coatings.</w:t>
+      </w:r>
+    </w:p>
+    <w:p>
+      <w:proofErr w:type="spellStart"/>
+      <w:r>
+        <w:t>Howerver</w:t>
+      </w:r>
+      <w:proofErr w:type="spellEnd"/>
+      <w:r>
+        <w:t>, cryogenically cooled mirror coatings will not be compatible with the current laser wavelength, which is 1</w:t>
+      </w:r>
+      <w:proofErr w:type="gramStart"/>
+      <w:r>
+        <w:t>\,\</w:t>
+      </w:r>
+      <w:proofErr w:type="spellStart"/>
+      <w:proofErr w:type="gramEnd"/>
+      <w:r>
+        <w:t>si</w:t>
+      </w:r>
+      <w:proofErr w:type="spellEnd"/>
+      <w:r>
+        <w:t>{\micro\metre}, and so future gravitational wave detectors may use either a 1.5\,\</w:t>
+      </w:r>
+      <w:proofErr w:type="spellStart"/>
+      <w:r>
+        <w:t>si</w:t>
+      </w:r>
+      <w:proofErr w:type="spellEnd"/>
+      <w:r>
+        <w:t>{\micro\metre} or 2\,\</w:t>
+      </w:r>
+      <w:proofErr w:type="spellStart"/>
+      <w:r>
+        <w:t>si</w:t>
+      </w:r>
+      <w:proofErr w:type="spellEnd"/>
+      <w:r>
+        <w:t>{\micro\metre} wavelength laser.</w:t>
+      </w:r>
+    </w:p>
+    <w:p>
+      <w:r>
+        <w:t xml:space="preserve">Currently, as </w:t>
+      </w:r>
+      <w:proofErr w:type="spellStart"/>
+      <w:r>
+        <w:t>InGaAs</w:t>
+      </w:r>
+      <w:proofErr w:type="spellEnd"/>
+      <w:r>
+        <w:t xml:space="preserve"> is widely used semiconductor for detecting 1-1.6\</w:t>
+      </w:r>
+      <w:proofErr w:type="spellStart"/>
+      <w:r>
+        <w:t>si</w:t>
+      </w:r>
+      <w:proofErr w:type="spellEnd"/>
+      <w:r>
+        <w:t xml:space="preserve">{\micro\metre} light and thus suitable </w:t>
+      </w:r>
+      <w:proofErr w:type="spellStart"/>
+      <w:r>
+        <w:t>InGaAs</w:t>
+      </w:r>
+      <w:proofErr w:type="spellEnd"/>
+      <w:r>
+        <w:t xml:space="preserve"> photodiodes were available for detecting the gravitational-wave-signal-containing laser beam that emerges from the OMC.</w:t>
+      </w:r>
+    </w:p>
+    <w:p>
+      <w:r>
+        <w:t xml:space="preserve">As the current </w:t>
+      </w:r>
+      <w:proofErr w:type="spellStart"/>
+      <w:r>
+        <w:t>InGaAs</w:t>
+      </w:r>
+      <w:proofErr w:type="spellEnd"/>
+      <w:r>
+        <w:t xml:space="preserve"> photodiodes are not sensitive to 2</w:t>
+      </w:r>
+      <w:proofErr w:type="gramStart"/>
+      <w:r>
+        <w:t>\,\</w:t>
+      </w:r>
+      <w:proofErr w:type="spellStart"/>
+      <w:proofErr w:type="gramEnd"/>
+      <w:r>
+        <w:t>si</w:t>
+      </w:r>
+      <w:proofErr w:type="spellEnd"/>
+      <w:r>
+        <w:t xml:space="preserve">{\micro\metre} light, `extended' </w:t>
+      </w:r>
+      <w:proofErr w:type="spellStart"/>
+      <w:r>
+        <w:t>InGaAs</w:t>
+      </w:r>
+      <w:proofErr w:type="spellEnd"/>
+      <w:r>
+        <w:t xml:space="preserve"> photodiodes may be used instead.</w:t>
+      </w:r>
+    </w:p>
+    <w:p>
+      <w:r>
+        <w:t xml:space="preserve">Alternative materials that could be used include HgCdTe and </w:t>
+      </w:r>
+      <w:proofErr w:type="spellStart"/>
+      <w:r>
+        <w:t>InSb</w:t>
+      </w:r>
+      <w:proofErr w:type="spellEnd"/>
+      <w:r>
+        <w:t>.</w:t>
+      </w:r>
+    </w:p>
+    <w:p>
+      <w:r>
+        <w:t xml:space="preserve">In this chapter, the relationship between quantum efficiency, reverse </w:t>
+      </w:r>
+      <w:proofErr w:type="gramStart"/>
+      <w:r>
+        <w:t>bias</w:t>
+      </w:r>
+      <w:proofErr w:type="gramEnd"/>
+      <w:r>
+        <w:t xml:space="preserve"> and noise in Extended </w:t>
+      </w:r>
+      <w:proofErr w:type="spellStart"/>
+      <w:r>
+        <w:t>InGaAs</w:t>
+      </w:r>
+      <w:proofErr w:type="spellEnd"/>
+      <w:r>
+        <w:t xml:space="preserve"> </w:t>
+      </w:r>
+      <w:proofErr w:type="spellStart"/>
+      <w:r>
+        <w:t>Photodoides</w:t>
+      </w:r>
+      <w:proofErr w:type="spellEnd"/>
+      <w:r>
+        <w:t xml:space="preserve"> is explored.</w:t>
+      </w:r>
+    </w:p>
+    <w:p>
+      <w:pPr>
+        <w:rPr>
+          <w:b/>
+          <w:bCs/>
+        </w:rPr>
+      </w:pPr>
+      <w:r>
+        <w:rPr>
+          <w:b/>
+          <w:bCs/>
+        </w:rPr>
+        <w:t xml:space="preserve">What is an Extended </w:t>
+      </w:r>
+      <w:proofErr w:type="spellStart"/>
+      <w:r>
+        <w:rPr>
+          <w:b/>
+          <w:bCs/>
+        </w:rPr>
+        <w:t>InGaAs</w:t>
+      </w:r>
+      <w:proofErr w:type="spellEnd"/>
+      <w:r>
+        <w:rPr>
+          <w:b/>
+          <w:bCs/>
+        </w:rPr>
+        <w:t xml:space="preserve"> </w:t>
+      </w:r>
+      <w:proofErr w:type="gramStart"/>
+      <w:r>
+        <w:rPr>
+          <w:b/>
+          <w:bCs/>
+        </w:rPr>
+        <w:t>Photodiode</w:t>
+      </w:r>
+      <w:proofErr w:type="gramEnd"/>
+    </w:p>
+    <w:p>
+      <w:r>
+        <w:t>A photodiode is a square law detector and so it produces a current that is proportional to the power of the light it is detecting.</w:t>
+      </w:r>
+    </w:p>
+    <w:p>
+      <w:r>
+        <w:t>To understand a PIN photodiode, it is useful to first consider a simpler PN photodiode.</w:t>
+      </w:r>
+    </w:p>
+    <w:p>
+      <w:r>
+        <w:t>At the interface between the p-doped and n-doped region, majority carriers from each side diffuse across it.</w:t>
+      </w:r>
+    </w:p>
+    <w:p>
+      <w:r>
+        <w:t xml:space="preserve">When a photon is incident on a </w:t>
+      </w:r>
+      <w:proofErr w:type="spellStart"/>
+      <w:r>
+        <w:t>pn</w:t>
+      </w:r>
+      <w:proofErr w:type="spellEnd"/>
+      <w:r>
+        <w:t xml:space="preserve"> junction, it will create an electron-hole pair.</w:t>
+      </w:r>
+    </w:p>
+    <w:p>
+      <w:r>
+        <w:t>To widen the depletion region, an external voltage can be used.</w:t>
+      </w:r>
+    </w:p>
+    <w:p>
+      <w:r>
+        <w:t>To further increase the width of the depletion region, a layer of intrinsic semiconductor can be used to separate the p and n-doped region.</w:t>
+      </w:r>
+    </w:p>
+    <w:p>
+      <w:proofErr w:type="spellStart"/>
+      <w:r>
+        <w:t>InGaAs</w:t>
+      </w:r>
+      <w:proofErr w:type="spellEnd"/>
+      <w:r>
+        <w:t xml:space="preserve"> is a widely used semiconductor for making photodiodes.</w:t>
+      </w:r>
+    </w:p>
+    <w:p>
+      <w:r>
+        <w:t>Longer wavelength sensitivity can be achieved by increasing the amount of indium doping.</w:t>
+      </w:r>
+    </w:p>
+    <w:p>
+      <w:pPr>
+        <w:rPr>
+          <w:b/>
+          <w:bCs/>
+        </w:rPr>
+      </w:pPr>
+      <w:r>
+        <w:rPr>
+          <w:b/>
+          <w:bCs/>
+        </w:rPr>
+        <w:t>What is Needed from the Read-out Photodiode in a Gravitational Wave detector</w:t>
+      </w:r>
+    </w:p>
+    <w:p>
+      <w:r>
+        <w:t>The photodiodes used in the readout of a gravitational wave interferometer should have a quantum efficiency of more than 99\%.</w:t>
+      </w:r>
+    </w:p>
+    <w:p>
+      <w:r>
+        <w:t>Photodiodes for gravitational wave detectors should have low $1/f$ dark noise so that they are not limited in the detection band by electronic noise.</w:t>
+      </w:r>
+    </w:p>
+    <w:p>
+      <w:r>
+        <w:t>The $1/f$ noise could be avoided by using a heterodyne detection, however the shot noise would increase if the mixing of the modulation and demodulation waveforms was not time independent \</w:t>
+      </w:r>
+      <w:proofErr w:type="gramStart"/>
+      <w:r>
+        <w:t>cite{</w:t>
+      </w:r>
+      <w:proofErr w:type="gramEnd"/>
+      <w:r>
+        <w:t>Meers1991} and this limits the choice of waveforms.</w:t>
+      </w:r>
+    </w:p>
+    <w:p>
+      <w:r>
+        <w:lastRenderedPageBreak/>
+        <w:t>Current gravitational wave detectors operate in the 1-10</w:t>
+      </w:r>
+      <w:proofErr w:type="gramStart"/>
+      <w:r>
+        <w:t>\,</w:t>
+      </w:r>
+      <w:proofErr w:type="spellStart"/>
+      <w:r>
+        <w:t>mW</w:t>
+      </w:r>
+      <w:proofErr w:type="spellEnd"/>
+      <w:proofErr w:type="gramEnd"/>
+      <w:r>
+        <w:t xml:space="preserve"> range at the output \cite{Prijatelj2012} to ensure that the junk light from other modes is a small portion of the total signal.</w:t>
+      </w:r>
+    </w:p>
+    <w:p>
+      <w:r>
+        <w:t xml:space="preserve">The properties were investigated in a selection </w:t>
+      </w:r>
+      <w:proofErr w:type="gramStart"/>
+      <w:r>
+        <w:t>commercially available photodiodes</w:t>
+      </w:r>
+      <w:proofErr w:type="gramEnd"/>
+      <w:r>
+        <w:t>.</w:t>
+      </w:r>
+    </w:p>
+    <w:p>
+      <w:pPr>
+        <w:rPr>
+          <w:b/>
+          <w:bCs/>
+        </w:rPr>
+      </w:pPr>
+      <w:r>
+        <w:rPr>
+          <w:b/>
+          <w:bCs/>
+        </w:rPr>
+        <w:t xml:space="preserve">Reverse Bias and the Quantum Efficiency of an Extended </w:t>
+      </w:r>
+      <w:proofErr w:type="spellStart"/>
+      <w:r>
+        <w:rPr>
+          <w:b/>
+          <w:bCs/>
+        </w:rPr>
+        <w:t>InGaAs</w:t>
+      </w:r>
+      <w:proofErr w:type="spellEnd"/>
+      <w:r>
+        <w:rPr>
+          <w:b/>
+          <w:bCs/>
+        </w:rPr>
+        <w:t xml:space="preserve"> Photodiode</w:t>
+      </w:r>
+      <w:r>
+        <w:rPr>
+          <w:b/>
+          <w:bCs/>
+        </w:rPr>
+        <w:t>.</w:t>
+      </w:r>
+    </w:p>
+    <w:p>
+      <w:r>
+        <w:t>To demonstrate the effect that reverse bias has on the quantum efficiency of a diode, the Thorlabs FD10D was used.</w:t>
+      </w:r>
+    </w:p>
+    <w:p>
+      <w:pPr>
+        <w:ind w:left="720"/>
+        <w:rPr>
+          <w:b/>
+          <w:bCs/>
+        </w:rPr>
+      </w:pPr>
+      <w:r>
+        <w:rPr>
+          <w:b/>
+          <w:bCs/>
+        </w:rPr>
+        <w:t>Method</w:t>
+      </w:r>
+    </w:p>
+    <w:p>
+      <w:pPr>
+        <w:ind w:left="720"/>
+      </w:pPr>
+      <w:r>
+        <w:t>To measure the photocurrent produced by the photodiode, a transimpedance amplifier that would be shot noise limited for 10</w:t>
+      </w:r>
+      <w:proofErr w:type="gramStart"/>
+      <w:r>
+        <w:t>\,mA</w:t>
+      </w:r>
+      <w:proofErr w:type="gramEnd"/>
+      <w:r>
+        <w:t xml:space="preserve"> of photocurrent was used.</w:t>
+      </w:r>
+    </w:p>
+    <w:p>
+      <w:pPr>
+        <w:ind w:left="720"/>
+      </w:pPr>
+      <w:r>
+        <w:t>A 1550</w:t>
+      </w:r>
+      <w:proofErr w:type="gramStart"/>
+      <w:r>
+        <w:t>\,nm</w:t>
+      </w:r>
+      <w:proofErr w:type="gramEnd"/>
+      <w:r>
+        <w:t xml:space="preserve"> wavelength laser (Pure Photonics PPL) was used to illuminate the photodiode (FD10D).</w:t>
+      </w:r>
+    </w:p>
+    <w:p>
+      <w:pPr>
+        <w:ind w:left="720"/>
+      </w:pPr>
+      <w:r>
+        <w:t>The FD10D was exposed to a variety of different beams to investigate the possibility that current density related phenomena could affect the results.</w:t>
+      </w:r>
+    </w:p>
+    <w:p>
+      <w:pPr>
+        <w:ind w:left="720"/>
+      </w:pPr>
+      <w:r>
+        <w:t>To measure the effect that changing the reverse bias voltage has on the quantum efficiency of a photodiode, two approaches were used.</w:t>
+      </w:r>
+    </w:p>
+    <w:p>
+      <w:pPr>
+        <w:ind w:left="720"/>
+      </w:pPr>
+      <w:r>
+        <w:t>As 0.6</w:t>
+      </w:r>
+      <w:proofErr w:type="gramStart"/>
+      <w:r>
+        <w:t>\,V</w:t>
+      </w:r>
+      <w:proofErr w:type="gramEnd"/>
+      <w:r>
+        <w:t xml:space="preserve"> reverse bias was the highest bias that gave an acceptable level of dark noise (see section \ref{}), the noise of the photocurrent was measured at a region where the noise of the laser was limited by shot noise.</w:t>
+      </w:r>
+    </w:p>
+    <w:p>
+      <w:pPr>
+        <w:ind w:left="720"/>
+      </w:pPr>
+      <w:r>
+        <w:t>At this bias, the quantum efficiency was calibrated using two other power meters.</w:t>
+      </w:r>
+    </w:p>
+    <w:p>
+      <w:pPr>
+        <w:ind w:left="720"/>
+        <w:rPr>
+          <w:b/>
+          <w:bCs/>
+        </w:rPr>
+      </w:pPr>
+      <w:r>
+        <w:rPr>
+          <w:b/>
+          <w:bCs/>
+        </w:rPr>
+        <w:t>Results</w:t>
+      </w:r>
+    </w:p>
+    <w:p>
+      <w:pPr>
+        <w:ind w:left="720"/>
+      </w:pPr>
+      <w:r>
+        <w:t>The effect of increasing the reverse bias on the quantum efficiency of the FD10D is shown in Figure \ref{</w:t>
+      </w:r>
+      <w:proofErr w:type="gramStart"/>
+      <w:r>
+        <w:t>fig:pdchapterfd</w:t>
+      </w:r>
+      <w:proofErr w:type="gramEnd"/>
+      <w:r>
+        <w:t>10dqeasfnofbias}.</w:t>
+      </w:r>
+    </w:p>
+    <w:p>
+      <w:pPr>
+        <w:ind w:left="720"/>
+      </w:pPr>
+      <w:r>
+        <w:t>Figure \ref{</w:t>
+      </w:r>
+      <w:proofErr w:type="gramStart"/>
+      <w:r>
+        <w:t>fig:pdchapterfd</w:t>
+      </w:r>
+      <w:proofErr w:type="gramEnd"/>
+      <w:r>
+        <w:t>10dnoisetest} shows the photocurrent measured has the noise level predicted by Equation \ref{</w:t>
+      </w:r>
+      <w:proofErr w:type="spellStart"/>
+      <w:r>
+        <w:t>eq:pd_chapter_noise_budget</w:t>
+      </w:r>
+      <w:proofErr w:type="spellEnd"/>
+      <w:r>
+        <w:t>}, meaning that the increase in photocurrent at a reverse bias voltage of 0.6V is, without doubt, an increase in quantum efficiency.</w:t>
+      </w:r>
+    </w:p>
+    <w:p>
+      <w:pPr>
+        <w:rPr>
+          <w:b/>
+          <w:bCs/>
+        </w:rPr>
+      </w:pPr>
+      <w:r>
+        <w:rPr>
+          <w:b/>
+          <w:bCs/>
+        </w:rPr>
+        <w:t xml:space="preserve">Dark Current and Dark Noise in Extended </w:t>
+      </w:r>
+      <w:proofErr w:type="spellStart"/>
+      <w:r>
+        <w:rPr>
+          <w:b/>
+          <w:bCs/>
+        </w:rPr>
+        <w:t>InGaAs</w:t>
+      </w:r>
+      <w:proofErr w:type="spellEnd"/>
+      <w:r>
+        <w:rPr>
+          <w:b/>
+          <w:bCs/>
+        </w:rPr>
+        <w:t xml:space="preserve"> Photodiodes</w:t>
+      </w:r>
+    </w:p>
+    <w:p>
+      <w:r>
+        <w:t xml:space="preserve">The dark current and dark noise of extended </w:t>
+      </w:r>
+      <w:proofErr w:type="spellStart"/>
+      <w:r>
+        <w:t>InGaAs</w:t>
+      </w:r>
+      <w:proofErr w:type="spellEnd"/>
+      <w:r>
+        <w:t xml:space="preserve"> photodiodes has been a limiting factor in previous quantum optics experiments \</w:t>
+      </w:r>
+      <w:proofErr w:type="gramStart"/>
+      <w:r>
+        <w:t>cite{</w:t>
+      </w:r>
+      <w:proofErr w:type="gramEnd"/>
+      <w:r>
+        <w:t>Mansell2018a,Yap2019}.</w:t>
+      </w:r>
+    </w:p>
+    <w:p>
+      <w:r>
+        <w:t>There is a balance to strike between the quantum efficiency and dark noise.</w:t>
+      </w:r>
+    </w:p>
+    <w:p>
+      <w:r>
+        <w:t>The noise of the current made by the photodiode can be modelled as</w:t>
+      </w:r>
+      <w:r>
+        <w:t xml:space="preserve"> [equation]</w:t>
+      </w:r>
+    </w:p>
+    <w:p>
+      <w:r>
+        <w:t xml:space="preserve">To measure the dark noise produced by the extended </w:t>
+      </w:r>
+      <w:proofErr w:type="spellStart"/>
+      <w:r>
+        <w:t>InGaAs</w:t>
+      </w:r>
+      <w:proofErr w:type="spellEnd"/>
+      <w:r>
+        <w:t xml:space="preserve"> photodiodes, a transimpedance amplifier with high gain was used.</w:t>
+      </w:r>
+    </w:p>
+    <w:p>
+      <w:pPr>
+        <w:ind w:firstLine="720"/>
+        <w:rPr>
+          <w:b/>
+          <w:bCs/>
+        </w:rPr>
+      </w:pPr>
+      <w:r>
+        <w:rPr>
+          <w:b/>
+          <w:bCs/>
+        </w:rPr>
+        <w:t>Room Temperature</w:t>
+      </w:r>
+    </w:p>
+    <w:p>
+      <w:pPr>
+        <w:ind w:left="720"/>
+      </w:pPr>
+      <w:r>
+        <w:t>The dark noise as a function of bias for the photodiodes listed in table \</w:t>
+      </w:r>
+      <w:proofErr w:type="gramStart"/>
+      <w:r>
+        <w:t>ref{</w:t>
+      </w:r>
+      <w:proofErr w:type="gramEnd"/>
+      <w:r>
+        <w:t>} was measured at room temperature ($\sim20\</w:t>
+      </w:r>
+      <w:proofErr w:type="spellStart"/>
+      <w:r>
+        <w:t>si</w:t>
+      </w:r>
+      <w:proofErr w:type="spellEnd"/>
+      <w:r>
+        <w:t>{\</w:t>
+      </w:r>
+      <w:proofErr w:type="spellStart"/>
+      <w:r>
+        <w:t>degreeCelsius</w:t>
+      </w:r>
+      <w:proofErr w:type="spellEnd"/>
+      <w:r>
+        <w:t>}$)</w:t>
+      </w:r>
+    </w:p>
+    <w:p>
+      <w:pPr>
+        <w:ind w:left="720"/>
+      </w:pPr>
+      <w:r>
+        <w:lastRenderedPageBreak/>
+        <w:t>The dark noise at 10</w:t>
+      </w:r>
+      <w:proofErr w:type="gramStart"/>
+      <w:r>
+        <w:t>\,Hz</w:t>
+      </w:r>
+      <w:proofErr w:type="gramEnd"/>
+      <w:r>
+        <w:t xml:space="preserve"> and the dark current as a function of bias for each diode is shown in Figure \ref{</w:t>
+      </w:r>
+      <w:proofErr w:type="spellStart"/>
+      <w:r>
+        <w:t>fig:pdchapterdarkcurrentmegaplot</w:t>
+      </w:r>
+      <w:proofErr w:type="spellEnd"/>
+      <w:r>
+        <w:t>}.</w:t>
+      </w:r>
+    </w:p>
+    <w:p>
+      <w:pPr>
+        <w:ind w:left="720"/>
+      </w:pPr>
+      <w:r>
+        <w:t>Where there were duplicate diodes to choose from, the superior diode was selected for characterisation.</w:t>
+      </w:r>
+    </w:p>
+    <w:p>
+      <w:pPr>
+        <w:ind w:firstLine="720"/>
+        <w:rPr>
+          <w:b/>
+          <w:bCs/>
+        </w:rPr>
+      </w:pPr>
+      <w:r>
+        <w:rPr>
+          <w:b/>
+          <w:bCs/>
+        </w:rPr>
+        <w:t>Cooling Experiment</w:t>
+      </w:r>
+    </w:p>
+    <w:p>
+      <w:pPr>
+        <w:ind w:left="720"/>
+      </w:pPr>
+      <w:r>
+        <w:t xml:space="preserve">The typical low temperature damage threshold for extended </w:t>
+      </w:r>
+      <w:proofErr w:type="spellStart"/>
+      <w:r>
+        <w:t>InGaAs</w:t>
+      </w:r>
+      <w:proofErr w:type="spellEnd"/>
+      <w:r>
+        <w:t xml:space="preserve"> photodiodes is \SI{-</w:t>
+      </w:r>
+      <w:proofErr w:type="gramStart"/>
+      <w:r>
+        <w:t>40}{</w:t>
+      </w:r>
+      <w:proofErr w:type="gramEnd"/>
+      <w:r>
+        <w:t>\</w:t>
+      </w:r>
+      <w:proofErr w:type="spellStart"/>
+      <w:r>
+        <w:t>degreeCelsius</w:t>
+      </w:r>
+      <w:proofErr w:type="spellEnd"/>
+      <w:r>
+        <w:t>}.</w:t>
+      </w:r>
+    </w:p>
+    <w:p>
+      <w:pPr>
+        <w:ind w:left="720"/>
+      </w:pPr>
+      <w:r>
+        <w:t>The dark noise and dark current for each diode in Table \</w:t>
+      </w:r>
+      <w:proofErr w:type="gramStart"/>
+      <w:r>
+        <w:t>ref{</w:t>
+      </w:r>
+      <w:proofErr w:type="gramEnd"/>
+      <w:r>
+        <w:t>} was measured at the diode's maximum reverse bias specified in the data sheet.</w:t>
+      </w:r>
+    </w:p>
+    <w:p>
+      <w:pPr>
+        <w:rPr>
+          <w:b/>
+          <w:bCs/>
+        </w:rPr>
+      </w:pPr>
+      <w:r>
+        <w:rPr>
+          <w:b/>
+          <w:bCs/>
+        </w:rPr>
+        <w:t xml:space="preserve">Saturation Limit for some laser components </w:t>
+      </w:r>
+      <w:r>
+        <w:rPr>
+          <w:b/>
+          <w:bCs/>
+        </w:rPr>
+        <w:t xml:space="preserve">Extended </w:t>
+      </w:r>
+      <w:proofErr w:type="spellStart"/>
+      <w:r>
+        <w:rPr>
+          <w:b/>
+          <w:bCs/>
+        </w:rPr>
+        <w:t>InGaAs</w:t>
+      </w:r>
+      <w:proofErr w:type="spellEnd"/>
+      <w:r>
+        <w:rPr>
+          <w:b/>
+          <w:bCs/>
+        </w:rPr>
+        <w:t xml:space="preserve"> </w:t>
+      </w:r>
+      <w:r>
+        <w:rPr>
+          <w:b/>
+          <w:bCs/>
+        </w:rPr>
+        <w:t>photodiodes</w:t>
+      </w:r>
+    </w:p>
+    <w:p>
+      <w:r>
+        <w:t xml:space="preserve">The laser components diodes were found to saturate at low powers if they were biased with a </w:t>
+      </w:r>
+      <w:proofErr w:type="gramStart"/>
+      <w:r>
+        <w:t>low enough voltages</w:t>
+      </w:r>
+      <w:proofErr w:type="gramEnd"/>
+      <w:r>
+        <w:t xml:space="preserve"> such that their dark noise was below the noise target</w:t>
+      </w:r>
+    </w:p>
+    <w:p>
+      <w:pPr>
+        <w:rPr>
+          <w:b/>
+          <w:bCs/>
+        </w:rPr>
+      </w:pPr>
+      <w:r>
+        <w:rPr>
+          <w:b/>
+          <w:bCs/>
+        </w:rPr>
+        <w:t xml:space="preserve">Forward Bias Characteristics of an Extended </w:t>
+      </w:r>
+      <w:proofErr w:type="spellStart"/>
+      <w:r>
+        <w:rPr>
+          <w:b/>
+          <w:bCs/>
+        </w:rPr>
+        <w:t>InGaAs</w:t>
+      </w:r>
+      <w:proofErr w:type="spellEnd"/>
+      <w:r>
+        <w:rPr>
+          <w:b/>
+          <w:bCs/>
+        </w:rPr>
+        <w:t xml:space="preserve"> Photodiode</w:t>
+      </w:r>
+    </w:p>
+    <w:p>
+      <w:pPr>
+        <w:rPr>
+          <w:b/>
+          <w:bCs/>
+        </w:rPr>
+      </w:pPr>
+    </w:p>
+    <w:p>
+      <w:pPr>
+        <w:rPr>
+          <w:b/>
+          <w:bCs/>
+        </w:rPr>
+      </w:pPr>
+      <w:proofErr w:type="spellStart"/>
+      <w:r>
+        <w:rPr>
+          <w:b/>
+          <w:bCs/>
+        </w:rPr>
+        <w:t>InSb</w:t>
+      </w:r>
+      <w:proofErr w:type="spellEnd"/>
+      <w:r>
+        <w:rPr>
+          <w:b/>
+          <w:bCs/>
+        </w:rPr>
+        <w:t xml:space="preserve"> testing</w:t>
+      </w:r>
+    </w:p>
+    <w:p>
+      <w:pPr>
+        <w:rPr>
+          <w:b/>
+          <w:bCs/>
+        </w:rPr>
+      </w:pPr>
+      <w:r>
+        <w:rPr>
+          <w:b/>
+          <w:bCs/>
+        </w:rPr>
+        <w:t>Discussion</w:t>
+      </w:r>
+    </w:p>
+    <w:p>
+      <w:pPr>
+        <w:rPr>
+          <w:b/>
+          <w:bCs/>
+        </w:rPr>
+      </w:pPr>
+      <w:r>
+        <w:rPr>
+          <w:b/>
+          <w:bCs/>
+        </w:rPr>
+        <w:t>Conclusion</w:t>
       </w:r>
     </w:p>
     <w:sectPr>

</xml_diff>

<commit_message>
adds info about defects and QE. added a couple of citatations and grammar check of the introduction.
</commit_message>
<xml_diff>
--- a/Structuring photodiode chapter.docx
+++ b/Structuring photodiode chapter.docx
@@ -471,21 +471,17 @@
       <w:r>
         <w:t xml:space="preserve">The current generation of gravitational will be limited by the thermal noise due to </w:t>
       </w:r>
-      <w:proofErr w:type="spellStart"/>
-      <w:r>
-        <w:t>brownian</w:t>
-      </w:r>
-      <w:proofErr w:type="spellEnd"/>
+      <w:r>
+        <w:t>Brownian</w:t>
+      </w:r>
       <w:r>
         <w:t xml:space="preserve"> motion of the molecules that make up the mirror coatings.</w:t>
       </w:r>
     </w:p>
     <w:p>
-      <w:proofErr w:type="spellStart"/>
-      <w:r>
-        <w:t>Howerver</w:t>
-      </w:r>
-      <w:proofErr w:type="spellEnd"/>
+      <w:r>
+        <w:t>However</w:t>
+      </w:r>
       <w:r>
         <w:t>, cryogenically cooled mirror coatings will not be compatible with the current laser wavelength, which is 1</w:t>
       </w:r>
@@ -605,7 +601,16 @@
       </w:r>
       <w:proofErr w:type="gramEnd"/>
       <w:r>
-        <w:t xml:space="preserve"> and noise in Extended </w:t>
+        <w:t xml:space="preserve"> and noise in</w:t>
+      </w:r>
+      <w:r>
+        <w:t xml:space="preserve"> </w:t>
+      </w:r>
+      <w:r>
+        <w:t>off-the-shelf</w:t>
+      </w:r>
+      <w:r>
+        <w:t xml:space="preserve"> Extended </w:t>
       </w:r>
       <w:proofErr w:type="spellStart"/>
       <w:r>
@@ -671,7 +676,16 @@
     </w:p>
     <w:p>
       <w:r>
-        <w:t>To understand a PIN photodiode, it is useful to first consider a simpler PN photodiode.</w:t>
+        <w:t>The basic physics of a PIN photodiode can be</w:t>
+      </w:r>
+      <w:r>
+        <w:t xml:space="preserve"> </w:t>
+      </w:r>
+      <w:r>
+        <w:t>qualitatively</w:t>
+      </w:r>
+      <w:r>
+        <w:t xml:space="preserve"> understood by considering a simpler PN diode.</w:t>
       </w:r>
     </w:p>
     <w:p>
@@ -689,7 +703,7 @@
       </w:r>
       <w:proofErr w:type="spellEnd"/>
       <w:r>
-        <w:t xml:space="preserve"> junction, it will create an electron-hole pair.</w:t>
+        <w:t xml:space="preserve"> junction, it will free an electron-hole pair from lattice if the photon has sufficient energy.</w:t>
       </w:r>
     </w:p>
     <w:p>
@@ -744,6 +758,7 @@
     </w:p>
     <w:p>
       <w:r>
+        <w:lastRenderedPageBreak/>
         <w:t>The $1/f$ noise could be avoided by using a heterodyne detection, however the shot noise would increase if the mixing of the modulation and demodulation waveforms was not time independent \</w:t>
       </w:r>
       <w:proofErr w:type="gramStart"/>
@@ -757,596 +772,1017 @@
     </w:p>
     <w:p>
       <w:r>
+        <w:t>Current gravitational wave detectors operate in the 1-10</w:t>
+      </w:r>
+      <w:proofErr w:type="gramStart"/>
+      <w:r>
+        <w:t>\,</w:t>
+      </w:r>
+      <w:proofErr w:type="spellStart"/>
+      <w:r>
+        <w:t>mW</w:t>
+      </w:r>
+      <w:proofErr w:type="spellEnd"/>
+      <w:proofErr w:type="gramEnd"/>
+      <w:r>
+        <w:t xml:space="preserve"> range at the output \cite{Prijatelj2012} to ensure that the junk light from other modes is a small portion of the total signal.</w:t>
+      </w:r>
+    </w:p>
+    <w:p>
+      <w:r>
+        <w:t xml:space="preserve">The quantum efficiency, saturation limit, dark current and dark noise was investigated in a selection </w:t>
+      </w:r>
+      <w:proofErr w:type="gramStart"/>
+      <w:r>
+        <w:t>commercially available photodiodes</w:t>
+      </w:r>
+      <w:proofErr w:type="gramEnd"/>
+      <w:r>
+        <w:t>.</w:t>
+      </w:r>
+    </w:p>
+    <w:p>
+      <w:pPr>
+        <w:rPr>
+          <w:b/>
+          <w:bCs/>
+        </w:rPr>
+      </w:pPr>
+      <w:r>
+        <w:rPr>
+          <w:b/>
+          <w:bCs/>
+        </w:rPr>
+        <w:t xml:space="preserve">Reverse Bias and the Quantum Efficiency of an Extended </w:t>
+      </w:r>
+      <w:proofErr w:type="spellStart"/>
+      <w:r>
+        <w:rPr>
+          <w:b/>
+          <w:bCs/>
+        </w:rPr>
+        <w:t>InGaAs</w:t>
+      </w:r>
+      <w:proofErr w:type="spellEnd"/>
+      <w:r>
+        <w:rPr>
+          <w:b/>
+          <w:bCs/>
+        </w:rPr>
+        <w:t xml:space="preserve"> Photodiode</w:t>
+      </w:r>
+      <w:r>
+        <w:rPr>
+          <w:b/>
+          <w:bCs/>
+        </w:rPr>
+        <w:t>.</w:t>
+      </w:r>
+    </w:p>
+    <w:p>
+      <w:r>
+        <w:t>To demonstrate the effect that reverse bias has on the quantum efficiency of a diode, the Thorlabs FD10D was used.</w:t>
+      </w:r>
+    </w:p>
+    <w:p>
+      <w:pPr>
+        <w:ind w:left="720"/>
+        <w:rPr>
+          <w:b/>
+          <w:bCs/>
+        </w:rPr>
+      </w:pPr>
+      <w:r>
+        <w:rPr>
+          <w:b/>
+          <w:bCs/>
+        </w:rPr>
+        <w:t>Method</w:t>
+      </w:r>
+    </w:p>
+    <w:p>
+      <w:pPr>
+        <w:ind w:left="720"/>
+      </w:pPr>
+      <w:r>
+        <w:t>To measure the photocurrent produced by the photodiode, a transimpedance amplifier that would be shot noise limited for 10</w:t>
+      </w:r>
+      <w:proofErr w:type="gramStart"/>
+      <w:r>
+        <w:t>\,mA</w:t>
+      </w:r>
+      <w:proofErr w:type="gramEnd"/>
+      <w:r>
+        <w:t xml:space="preserve"> of photocurrent was used.</w:t>
+      </w:r>
+    </w:p>
+    <w:p>
+      <w:pPr>
+        <w:ind w:left="720"/>
+      </w:pPr>
+      <w:r>
+        <w:t>A 1550</w:t>
+      </w:r>
+      <w:proofErr w:type="gramStart"/>
+      <w:r>
+        <w:t>\,nm</w:t>
+      </w:r>
+      <w:proofErr w:type="gramEnd"/>
+      <w:r>
+        <w:t xml:space="preserve"> wavelength laser (Pure Photonics PPL) was used to illuminate the photodiode (FD10D).</w:t>
+      </w:r>
+    </w:p>
+    <w:p>
+      <w:pPr>
+        <w:ind w:left="720"/>
+      </w:pPr>
+      <w:r>
+        <w:t>The FD10D was exposed to a variety of different beams to investigate the possibility that current density related phenomena could affect the results.</w:t>
+      </w:r>
+    </w:p>
+    <w:p>
+      <w:pPr>
+        <w:ind w:left="720"/>
+      </w:pPr>
+      <w:r>
+        <w:t>To measure the effect that changing the reverse bias voltage has on the quantum efficiency of a photodiode, two approaches were used.</w:t>
+      </w:r>
+    </w:p>
+    <w:p>
+      <w:pPr>
+        <w:ind w:left="720"/>
+      </w:pPr>
+      <w:r>
+        <w:t>As 0.6</w:t>
+      </w:r>
+      <w:proofErr w:type="gramStart"/>
+      <w:r>
+        <w:t>\,V</w:t>
+      </w:r>
+      <w:proofErr w:type="gramEnd"/>
+      <w:r>
+        <w:t xml:space="preserve"> reverse bias was the highest bias that gave an acceptable level of dark noise (see section \ref{}), the noise of the photocurrent was measured at a region where the noise of the laser was limited by shot noise.</w:t>
+      </w:r>
+    </w:p>
+    <w:p>
+      <w:pPr>
+        <w:ind w:left="720"/>
+      </w:pPr>
+      <w:r>
+        <w:t>At this bias, the quantum efficiency was calibrated using two other power meters.</w:t>
+      </w:r>
+    </w:p>
+    <w:p>
+      <w:pPr>
+        <w:ind w:left="720"/>
+        <w:rPr>
+          <w:b/>
+          <w:bCs/>
+        </w:rPr>
+      </w:pPr>
+      <w:r>
+        <w:rPr>
+          <w:b/>
+          <w:bCs/>
+        </w:rPr>
+        <w:t>Results</w:t>
+      </w:r>
+    </w:p>
+    <w:p>
+      <w:pPr>
+        <w:ind w:left="720"/>
+      </w:pPr>
+      <w:r>
+        <w:t>The effect of increasing the reverse bias on the quantum efficiency of the FD10D is shown in Figure \ref{</w:t>
+      </w:r>
+      <w:proofErr w:type="gramStart"/>
+      <w:r>
+        <w:t>fig:pdchapterfd</w:t>
+      </w:r>
+      <w:proofErr w:type="gramEnd"/>
+      <w:r>
+        <w:t>10dqeasfnofbias}.</w:t>
+      </w:r>
+    </w:p>
+    <w:p>
+      <w:pPr>
+        <w:ind w:left="720"/>
+      </w:pPr>
+      <w:r>
+        <w:t>Figure \ref{</w:t>
+      </w:r>
+      <w:proofErr w:type="gramStart"/>
+      <w:r>
+        <w:t>fig:pdchapterfd</w:t>
+      </w:r>
+      <w:proofErr w:type="gramEnd"/>
+      <w:r>
+        <w:t>10dnoisetest} shows the photocurrent measured has the noise level predicted by Equation \ref{</w:t>
+      </w:r>
+      <w:proofErr w:type="spellStart"/>
+      <w:r>
+        <w:t>eq:pd_chapter_noise_budget</w:t>
+      </w:r>
+      <w:proofErr w:type="spellEnd"/>
+      <w:r>
+        <w:t>}, meaning that the increase in photocurrent at a reverse bias voltage of 0.6V is, without doubt, an increase in quantum efficiency.</w:t>
+      </w:r>
+    </w:p>
+    <w:p>
+      <w:pPr>
+        <w:rPr>
+          <w:b/>
+          <w:bCs/>
+        </w:rPr>
+      </w:pPr>
+      <w:r>
+        <w:rPr>
+          <w:b/>
+          <w:bCs/>
+        </w:rPr>
+        <w:t xml:space="preserve">Dark Current and Dark Noise in Extended </w:t>
+      </w:r>
+      <w:proofErr w:type="spellStart"/>
+      <w:r>
+        <w:rPr>
+          <w:b/>
+          <w:bCs/>
+        </w:rPr>
+        <w:t>InGaAs</w:t>
+      </w:r>
+      <w:proofErr w:type="spellEnd"/>
+      <w:r>
+        <w:rPr>
+          <w:b/>
+          <w:bCs/>
+        </w:rPr>
+        <w:t xml:space="preserve"> Photodiodes</w:t>
+      </w:r>
+    </w:p>
+    <w:p>
+      <w:r>
+        <w:t xml:space="preserve">The dark current and dark noise of extended </w:t>
+      </w:r>
+      <w:proofErr w:type="spellStart"/>
+      <w:r>
+        <w:t>InGaAs</w:t>
+      </w:r>
+      <w:proofErr w:type="spellEnd"/>
+      <w:r>
+        <w:t xml:space="preserve"> photodiodes has been a limiting factor in previous quantum optics experiments \</w:t>
+      </w:r>
+      <w:proofErr w:type="gramStart"/>
+      <w:r>
+        <w:t>cite{</w:t>
+      </w:r>
+      <w:proofErr w:type="gramEnd"/>
+      <w:r>
+        <w:t>Mansell2018a,Yap2019}.</w:t>
+      </w:r>
+    </w:p>
+    <w:p>
+      <w:r>
+        <w:t>There is a balance to strike between the quantum efficiency and dark noise.</w:t>
+      </w:r>
+    </w:p>
+    <w:p>
+      <w:r>
+        <w:t>The noise of the current made by the photodiode can be modelled as</w:t>
+      </w:r>
+      <w:r>
+        <w:t xml:space="preserve"> [equation]</w:t>
+      </w:r>
+    </w:p>
+    <w:p>
+      <w:r>
         <w:lastRenderedPageBreak/>
-        <w:t>Current gravitational wave detectors operate in the 1-10</w:t>
+        <w:t xml:space="preserve">To measure the dark noise produced by the extended </w:t>
+      </w:r>
+      <w:proofErr w:type="spellStart"/>
+      <w:r>
+        <w:t>InGaAs</w:t>
+      </w:r>
+      <w:proofErr w:type="spellEnd"/>
+      <w:r>
+        <w:t xml:space="preserve"> photodiodes, a transimpedance amplifier with high gain was used.</w:t>
+      </w:r>
+    </w:p>
+    <w:p>
+      <w:pPr>
+        <w:ind w:firstLine="720"/>
+        <w:rPr>
+          <w:b/>
+          <w:bCs/>
+        </w:rPr>
+      </w:pPr>
+      <w:r>
+        <w:rPr>
+          <w:b/>
+          <w:bCs/>
+        </w:rPr>
+        <w:t>Room Temperature</w:t>
+      </w:r>
+    </w:p>
+    <w:p>
+      <w:pPr>
+        <w:ind w:left="720"/>
+      </w:pPr>
+      <w:r>
+        <w:t>The dark noise as a function of bias for the photodiodes listed in table \</w:t>
       </w:r>
       <w:proofErr w:type="gramStart"/>
       <w:r>
-        <w:t>\,</w:t>
-      </w:r>
-      <w:proofErr w:type="spellStart"/>
-      <w:r>
-        <w:t>mW</w:t>
-      </w:r>
-      <w:proofErr w:type="spellEnd"/>
+        <w:t>ref{</w:t>
+      </w:r>
       <w:proofErr w:type="gramEnd"/>
       <w:r>
-        <w:t xml:space="preserve"> range at the output \cite{Prijatelj2012} to ensure that the junk light from other modes is a small portion of the total signal.</w:t>
-      </w:r>
-    </w:p>
-    <w:p>
-      <w:r>
-        <w:t xml:space="preserve">The properties were investigated in a selection </w:t>
+        <w:t>} was measured at room temperature ($\sim20\</w:t>
+      </w:r>
+      <w:proofErr w:type="spellStart"/>
+      <w:r>
+        <w:t>si</w:t>
+      </w:r>
+      <w:proofErr w:type="spellEnd"/>
+      <w:r>
+        <w:t>{\</w:t>
+      </w:r>
+      <w:proofErr w:type="spellStart"/>
+      <w:r>
+        <w:t>degreeCelsius</w:t>
+      </w:r>
+      <w:proofErr w:type="spellEnd"/>
+      <w:r>
+        <w:t>}$)</w:t>
+      </w:r>
+    </w:p>
+    <w:p>
+      <w:pPr>
+        <w:ind w:left="720"/>
+      </w:pPr>
+      <w:r>
+        <w:t>The dark noise at 10</w:t>
       </w:r>
       <w:proofErr w:type="gramStart"/>
       <w:r>
-        <w:t>commercially available photodiodes</w:t>
+        <w:t>\,Hz</w:t>
       </w:r>
       <w:proofErr w:type="gramEnd"/>
       <w:r>
+        <w:t xml:space="preserve"> and the dark current as a function of bias for each diode is shown in Figure \ref{</w:t>
+      </w:r>
+      <w:proofErr w:type="spellStart"/>
+      <w:r>
+        <w:t>fig:pdchapterdarkcurrentmegaplot</w:t>
+      </w:r>
+      <w:proofErr w:type="spellEnd"/>
+      <w:r>
+        <w:t>}.</w:t>
+      </w:r>
+    </w:p>
+    <w:p>
+      <w:pPr>
+        <w:ind w:left="720"/>
+      </w:pPr>
+      <w:r>
+        <w:t>Where there were duplicate diodes to choose from, the superior diode was selected for characterisation.</w:t>
+      </w:r>
+    </w:p>
+    <w:p>
+      <w:pPr>
+        <w:ind w:firstLine="720"/>
+        <w:rPr>
+          <w:b/>
+          <w:bCs/>
+        </w:rPr>
+      </w:pPr>
+      <w:r>
+        <w:rPr>
+          <w:b/>
+          <w:bCs/>
+        </w:rPr>
+        <w:t>Cooling Experiment</w:t>
+      </w:r>
+    </w:p>
+    <w:p>
+      <w:pPr>
+        <w:ind w:left="720"/>
+      </w:pPr>
+      <w:r>
+        <w:t xml:space="preserve">The typical low temperature damage threshold for extended </w:t>
+      </w:r>
+      <w:proofErr w:type="spellStart"/>
+      <w:r>
+        <w:t>InGaAs</w:t>
+      </w:r>
+      <w:proofErr w:type="spellEnd"/>
+      <w:r>
+        <w:t xml:space="preserve"> photodiodes is \SI{-</w:t>
+      </w:r>
+      <w:proofErr w:type="gramStart"/>
+      <w:r>
+        <w:t>40}{</w:t>
+      </w:r>
+      <w:proofErr w:type="gramEnd"/>
+      <w:r>
+        <w:t>\</w:t>
+      </w:r>
+      <w:proofErr w:type="spellStart"/>
+      <w:r>
+        <w:t>degreeCelsius</w:t>
+      </w:r>
+      <w:proofErr w:type="spellEnd"/>
+      <w:r>
+        <w:t>}.</w:t>
+      </w:r>
+    </w:p>
+    <w:p>
+      <w:pPr>
+        <w:ind w:left="720"/>
+      </w:pPr>
+      <w:r>
+        <w:t>The dark noise and dark current for each diode in Table \</w:t>
+      </w:r>
+      <w:proofErr w:type="gramStart"/>
+      <w:r>
+        <w:t>ref{</w:t>
+      </w:r>
+      <w:proofErr w:type="gramEnd"/>
+      <w:r>
+        <w:t>} was measured at the diode's maximum reverse bias specified in the data sheet.</w:t>
+      </w:r>
+    </w:p>
+    <w:p>
+      <w:pPr>
+        <w:rPr>
+          <w:b/>
+          <w:bCs/>
+        </w:rPr>
+      </w:pPr>
+      <w:r>
+        <w:rPr>
+          <w:b/>
+          <w:bCs/>
+        </w:rPr>
+        <w:t xml:space="preserve">Saturation Limit for some laser components </w:t>
+      </w:r>
+      <w:r>
+        <w:rPr>
+          <w:b/>
+          <w:bCs/>
+        </w:rPr>
+        <w:t xml:space="preserve">Extended </w:t>
+      </w:r>
+      <w:proofErr w:type="spellStart"/>
+      <w:r>
+        <w:rPr>
+          <w:b/>
+          <w:bCs/>
+        </w:rPr>
+        <w:t>InGaAs</w:t>
+      </w:r>
+      <w:proofErr w:type="spellEnd"/>
+      <w:r>
+        <w:rPr>
+          <w:b/>
+          <w:bCs/>
+        </w:rPr>
+        <w:t xml:space="preserve"> </w:t>
+      </w:r>
+      <w:r>
+        <w:rPr>
+          <w:b/>
+          <w:bCs/>
+        </w:rPr>
+        <w:t>photodiodes</w:t>
+      </w:r>
+    </w:p>
+    <w:p>
+      <w:r>
+        <w:t xml:space="preserve">The laser components diodes were found to saturate at low powers if they were biased with a </w:t>
+      </w:r>
+      <w:proofErr w:type="gramStart"/>
+      <w:r>
+        <w:t>low enough voltages</w:t>
+      </w:r>
+      <w:proofErr w:type="gramEnd"/>
+      <w:r>
+        <w:t xml:space="preserve"> such that their dark noise was below the noise target</w:t>
+      </w:r>
+    </w:p>
+    <w:p>
+      <w:pPr>
+        <w:rPr>
+          <w:b/>
+          <w:bCs/>
+        </w:rPr>
+      </w:pPr>
+      <w:r>
+        <w:rPr>
+          <w:b/>
+          <w:bCs/>
+        </w:rPr>
+        <w:t>Excess Noise in the IG24x500S4i</w:t>
+      </w:r>
+    </w:p>
+    <w:p>
+      <w:r>
+        <w:t xml:space="preserve">The experiment explained in Section \ref{label} showed that the noise of the photocurrent IG24x500S4i was higher </w:t>
+      </w:r>
+      <w:proofErr w:type="spellStart"/>
+      <w:r>
+        <w:t>that</w:t>
+      </w:r>
+      <w:proofErr w:type="spellEnd"/>
+      <w:r>
+        <w:t xml:space="preserve"> predicted by equation \ref{</w:t>
+      </w:r>
+      <w:proofErr w:type="spellStart"/>
+      <w:proofErr w:type="gramStart"/>
+      <w:r>
+        <w:t>eq:pd</w:t>
+      </w:r>
+      <w:proofErr w:type="gramEnd"/>
+      <w:r>
+        <w:t>_chapter_noise_budget</w:t>
+      </w:r>
+      <w:proofErr w:type="spellEnd"/>
+      <w:r>
+        <w:t>} by a factor of $\sim2$</w:t>
+      </w:r>
+      <w:r>
         <w:t>.</w:t>
       </w:r>
     </w:p>
     <w:p>
-      <w:pPr>
-        <w:rPr>
-          <w:b/>
-          <w:bCs/>
-        </w:rPr>
-      </w:pPr>
-      <w:r>
-        <w:rPr>
-          <w:b/>
-          <w:bCs/>
-        </w:rPr>
-        <w:t xml:space="preserve">Reverse Bias and the Quantum Efficiency of an Extended </w:t>
-      </w:r>
-      <w:proofErr w:type="spellStart"/>
-      <w:r>
-        <w:rPr>
-          <w:b/>
-          <w:bCs/>
-        </w:rPr>
+      <w:r>
+        <w:t>To rule out bias noise causing this, a noise projection measurement was made.</w:t>
+      </w:r>
+    </w:p>
+    <w:p>
+      <w:r>
+        <w:t xml:space="preserve">The </w:t>
+      </w:r>
+      <w:proofErr w:type="spellStart"/>
+      <w:r>
+        <w:t>ideality</w:t>
+      </w:r>
+      <w:proofErr w:type="spellEnd"/>
+      <w:r>
+        <w:t xml:space="preserve"> factor of the IG24 was investigated.</w:t>
+      </w:r>
+    </w:p>
+    <w:p>
+      <w:r>
+        <w:t>The source of this excess noise is still unclear</w:t>
+      </w:r>
+    </w:p>
+    <w:p>
+      <w:pPr>
+        <w:rPr>
+          <w:b/>
+          <w:bCs/>
+        </w:rPr>
+      </w:pPr>
+      <w:r>
+        <w:rPr>
+          <w:b/>
+          <w:bCs/>
+        </w:rPr>
+        <w:t xml:space="preserve">Properties of an </w:t>
+      </w:r>
+      <w:proofErr w:type="spellStart"/>
+      <w:r>
+        <w:rPr>
+          <w:b/>
+          <w:bCs/>
+        </w:rPr>
+        <w:t>InSb</w:t>
+      </w:r>
+      <w:proofErr w:type="spellEnd"/>
+      <w:r>
+        <w:rPr>
+          <w:b/>
+          <w:bCs/>
+        </w:rPr>
+        <w:t xml:space="preserve"> detector</w:t>
+      </w:r>
+    </w:p>
+    <w:p>
+      <w:proofErr w:type="spellStart"/>
+      <w:r>
+        <w:t>InSb</w:t>
+      </w:r>
+      <w:proofErr w:type="spellEnd"/>
+      <w:r>
+        <w:t xml:space="preserve"> detectors have high quantum efficiency \</w:t>
+      </w:r>
+      <w:proofErr w:type="gramStart"/>
+      <w:r>
+        <w:t>cite{</w:t>
+      </w:r>
+      <w:proofErr w:type="gramEnd"/>
+      <w:r>
+        <w:t>Beattie1962} to short infrared wavelength light</w:t>
+      </w:r>
+      <w:r>
+        <w:t>.</w:t>
+      </w:r>
+    </w:p>
+    <w:p>
+      <w:r>
+        <w:t>The detector was characterised at by placing a low emissivity material in front of the detector.</w:t>
+      </w:r>
+    </w:p>
+    <w:p>
+      <w:r>
+        <w:t xml:space="preserve">As the quantum efficiency of </w:t>
+      </w:r>
+      <w:proofErr w:type="spellStart"/>
+      <w:r>
+        <w:t>InSb</w:t>
+      </w:r>
+      <w:proofErr w:type="spellEnd"/>
+      <w:r>
+        <w:t xml:space="preserve"> photodetectors depends strongly on the reverse bias for 1.55\</w:t>
+      </w:r>
+      <w:proofErr w:type="spellStart"/>
+      <w:r>
+        <w:t>si</w:t>
+      </w:r>
+      <w:proofErr w:type="spellEnd"/>
+      <w:r>
+        <w:t>{\micro\meter} wavelengths \</w:t>
+      </w:r>
+      <w:proofErr w:type="gramStart"/>
+      <w:r>
+        <w:t>cite{</w:t>
+      </w:r>
+      <w:proofErr w:type="gramEnd"/>
+      <w:r>
+        <w:t>Kimukin2003}, the behaviour of the P5968 under a reverse bias was investigated</w:t>
+      </w:r>
+      <w:r>
+        <w:t>.</w:t>
+      </w:r>
+    </w:p>
+    <w:p>
+      <w:pPr>
+        <w:rPr>
+          <w:b/>
+          <w:bCs/>
+        </w:rPr>
+      </w:pPr>
+      <w:r>
+        <w:rPr>
+          <w:b/>
+          <w:bCs/>
+        </w:rPr>
+        <w:t>Discussion</w:t>
+      </w:r>
+    </w:p>
+    <w:p>
+      <w:r>
+        <w:t>N</w:t>
+      </w:r>
+      <w:r>
+        <w:t>one of the photodiodes tested in this section would meet the requirements described in Section \ref{</w:t>
+      </w:r>
+      <w:proofErr w:type="spellStart"/>
+      <w:proofErr w:type="gramStart"/>
+      <w:r>
+        <w:t>sec:pd</w:t>
+      </w:r>
+      <w:proofErr w:type="gramEnd"/>
+      <w:r>
+        <w:t>_chapter_grav_wave_ifo_requirments</w:t>
+      </w:r>
+      <w:proofErr w:type="spellEnd"/>
+      <w:r>
+        <w:t>} as the quantum efficiency is specified in all of their datasheets to be below 99\%.</w:t>
+      </w:r>
+    </w:p>
+    <w:p>
+      <w:r>
+        <w:lastRenderedPageBreak/>
+        <w:t xml:space="preserve">The results cover seven different models of extended </w:t>
+      </w:r>
+      <w:proofErr w:type="spellStart"/>
+      <w:r>
         <w:t>InGaAs</w:t>
       </w:r>
       <w:proofErr w:type="spellEnd"/>
       <w:r>
-        <w:rPr>
-          <w:b/>
-          <w:bCs/>
-        </w:rPr>
-        <w:t xml:space="preserve"> Photodiode</w:t>
-      </w:r>
-      <w:r>
-        <w:rPr>
-          <w:b/>
-          <w:bCs/>
-        </w:rPr>
+        <w:t xml:space="preserve"> photodiode and so it is possible that another photodiode manufacturer (</w:t>
+      </w:r>
+      <w:proofErr w:type="spellStart"/>
+      <w:proofErr w:type="gramStart"/>
+      <w:r>
+        <w:t>e.g</w:t>
+      </w:r>
+      <w:proofErr w:type="gramEnd"/>
+      <w:r>
+        <w:t>~Teledyne</w:t>
+      </w:r>
+      <w:proofErr w:type="spellEnd"/>
+      <w:r>
+        <w:t xml:space="preserve"> Judson) have better performing photodiodes than the ones tested in this Chapter.</w:t>
+      </w:r>
+    </w:p>
+    <w:p>
+      <w:r>
+        <w:t>Section \ref{</w:t>
+      </w:r>
+      <w:proofErr w:type="spellStart"/>
+      <w:proofErr w:type="gramStart"/>
+      <w:r>
+        <w:t>sec:pd</w:t>
+      </w:r>
+      <w:proofErr w:type="gramEnd"/>
+      <w:r>
+        <w:t>_chapter_reverse_bias_qe</w:t>
+      </w:r>
+      <w:proofErr w:type="spellEnd"/>
+      <w:r>
+        <w:t xml:space="preserve">} shows the effect that biasing an extended </w:t>
+      </w:r>
+      <w:proofErr w:type="spellStart"/>
+      <w:r>
+        <w:t>InGaAs</w:t>
+      </w:r>
+      <w:proofErr w:type="spellEnd"/>
+      <w:r>
+        <w:t xml:space="preserve"> photodiode can have on its quantum efficiency.</w:t>
+      </w:r>
+    </w:p>
+    <w:p>
+      <w:r>
+        <w:t xml:space="preserve">The depletion region of Extended </w:t>
+      </w:r>
+      <w:proofErr w:type="spellStart"/>
+      <w:r>
+        <w:t>InGaAs</w:t>
+      </w:r>
+      <w:proofErr w:type="spellEnd"/>
+      <w:r>
+        <w:t xml:space="preserve"> photodiodes is quite small when there is no bias because it is difficult to create thick Extended </w:t>
+      </w:r>
+      <w:proofErr w:type="spellStart"/>
+      <w:r>
+        <w:t>InGaAs</w:t>
+      </w:r>
+      <w:proofErr w:type="spellEnd"/>
+      <w:r>
+        <w:t xml:space="preserve"> wafers due to the lattice mismatch between the </w:t>
+      </w:r>
+      <w:proofErr w:type="spellStart"/>
+      <w:r>
+        <w:t>InP</w:t>
+      </w:r>
+      <w:proofErr w:type="spellEnd"/>
+      <w:r>
+        <w:t xml:space="preserve"> substrate and the </w:t>
+      </w:r>
+      <w:proofErr w:type="spellStart"/>
+      <w:r>
+        <w:t>InGaAs</w:t>
+      </w:r>
+      <w:proofErr w:type="spellEnd"/>
+      <w:r>
         <w:t>.</w:t>
       </w:r>
     </w:p>
     <w:p>
       <w:r>
-        <w:t>To demonstrate the effect that reverse bias has on the quantum efficiency of a diode, the Thorlabs FD10D was used.</w:t>
-      </w:r>
-    </w:p>
-    <w:p>
-      <w:pPr>
-        <w:ind w:left="720"/>
-        <w:rPr>
-          <w:b/>
-          <w:bCs/>
-        </w:rPr>
-      </w:pPr>
-      <w:r>
-        <w:rPr>
-          <w:b/>
-          <w:bCs/>
-        </w:rPr>
-        <w:t>Method</w:t>
-      </w:r>
-    </w:p>
-    <w:p>
-      <w:pPr>
-        <w:ind w:left="720"/>
-      </w:pPr>
-      <w:r>
-        <w:t>To measure the photocurrent produced by the photodiode, a transimpedance amplifier that would be shot noise limited for 10</w:t>
+        <w:t>The high amount of dark noise associated with the bias that was found in the Laser Components range of diodes (see section \</w:t>
       </w:r>
       <w:proofErr w:type="gramStart"/>
       <w:r>
-        <w:t>\,mA</w:t>
+        <w:t>ref{</w:t>
       </w:r>
       <w:proofErr w:type="gramEnd"/>
       <w:r>
-        <w:t xml:space="preserve"> of photocurrent was used.</w:t>
-      </w:r>
-    </w:p>
-    <w:p>
-      <w:pPr>
-        <w:ind w:left="720"/>
-      </w:pPr>
-      <w:r>
-        <w:t>A 1550</w:t>
+        <w:t>}) meant that they had to be operated with low biases if they were to be able to produce shot noise limited photocurrents above 10\,Hz.</w:t>
+      </w:r>
+    </w:p>
+    <w:p>
+      <w:r>
+        <w:t xml:space="preserve">Usually, applying a reverse bias is done to increase the bandwidth of a photodiode, however a few hundred picofarads of capacitance is manageable amount to design a transimpedance amplifier </w:t>
       </w:r>
       <w:proofErr w:type="gramStart"/>
       <w:r>
-        <w:t>\,nm</w:t>
+        <w:t>around  for</w:t>
       </w:r>
       <w:proofErr w:type="gramEnd"/>
       <w:r>
-        <w:t xml:space="preserve"> wavelength laser (Pure Photonics PPL) was used to illuminate the photodiode (FD10D).</w:t>
-      </w:r>
-    </w:p>
-    <w:p>
-      <w:pPr>
-        <w:ind w:left="720"/>
-      </w:pPr>
-      <w:r>
-        <w:t>The FD10D was exposed to a variety of different beams to investigate the possibility that current density related phenomena could affect the results.</w:t>
-      </w:r>
-    </w:p>
-    <w:p>
-      <w:pPr>
-        <w:ind w:left="720"/>
-      </w:pPr>
-      <w:r>
-        <w:t>To measure the effect that changing the reverse bias voltage has on the quantum efficiency of a photodiode, two approaches were used.</w:t>
-      </w:r>
-    </w:p>
-    <w:p>
-      <w:pPr>
-        <w:ind w:left="720"/>
-      </w:pPr>
-      <w:r>
-        <w:t>As 0.6</w:t>
+        <w:t xml:space="preserve"> a DC readout scheme such as that used by LIGO.</w:t>
+      </w:r>
+    </w:p>
+    <w:p>
+      <w:r>
+        <w:t>While the dark current does not depend strongly on the reverse bias when the bias is below the tunnelling threshold, the dark noise of every photodiode increased as its reverse bias increased.</w:t>
+      </w:r>
+    </w:p>
+    <w:p>
+      <w:r>
+        <w:t>The dark noise can vary considerably amongst a batch of photodiodes, for example there was nearly a factor of 100 between the dark noise of the two Hamamatsu G12182-010k tested (see Figure \ref{</w:t>
       </w:r>
       <w:proofErr w:type="gramStart"/>
       <w:r>
-        <w:t>\,V</w:t>
+        <w:t>fig:pdchapterg</w:t>
       </w:r>
       <w:proofErr w:type="gramEnd"/>
       <w:r>
-        <w:t xml:space="preserve"> reverse bias was the highest bias that gave an acceptable level of dark noise (see section \ref{}), the noise of the photocurrent was measured at a region where the noise of the laser was limited by shot noise.</w:t>
-      </w:r>
-    </w:p>
-    <w:p>
-      <w:pPr>
-        <w:ind w:left="720"/>
-      </w:pPr>
-      <w:r>
-        <w:t>At this bias, the quantum efficiency was calibrated using two other power meters.</w:t>
-      </w:r>
-    </w:p>
-    <w:p>
-      <w:pPr>
-        <w:ind w:left="720"/>
-        <w:rPr>
-          <w:b/>
-          <w:bCs/>
-        </w:rPr>
-      </w:pPr>
-      <w:r>
-        <w:rPr>
-          <w:b/>
-          <w:bCs/>
-        </w:rPr>
-        <w:t>Results</w:t>
-      </w:r>
-    </w:p>
-    <w:p>
-      <w:pPr>
-        <w:ind w:left="720"/>
-      </w:pPr>
-      <w:r>
-        <w:t>The effect of increasing the reverse bias on the quantum efficiency of the FD10D is shown in Figure \ref{</w:t>
+        <w:t>12182-010knoisecompare}).</w:t>
+      </w:r>
+    </w:p>
+    <w:p>
+      <w:r>
+        <w:t>The dark noise of a photodiode can be significantly reduced by cooling it.</w:t>
+      </w:r>
+    </w:p>
+    <w:p>
+      <w:pPr>
+        <w:rPr>
+          <w:b/>
+          <w:bCs/>
+        </w:rPr>
+      </w:pPr>
+      <w:r>
+        <w:rPr>
+          <w:b/>
+          <w:bCs/>
+        </w:rPr>
+        <w:t>Conclusion</w:t>
+      </w:r>
+    </w:p>
+    <w:p>
+      <w:r>
+        <w:t xml:space="preserve">Extended </w:t>
+      </w:r>
+      <w:proofErr w:type="spellStart"/>
+      <w:r>
+        <w:t>InGaAs</w:t>
+      </w:r>
+      <w:proofErr w:type="spellEnd"/>
+      <w:r>
+        <w:t xml:space="preserve"> photodiodes are widely available detectors that can be used to detect $2</w:t>
       </w:r>
       <w:proofErr w:type="gramStart"/>
       <w:r>
-        <w:t>fig:pdchapterfd</w:t>
-      </w:r>
+        <w:t>\,\</w:t>
+      </w:r>
+      <w:proofErr w:type="spellStart"/>
       <w:proofErr w:type="gramEnd"/>
       <w:r>
-        <w:t>10dqeasfnofbias}.</w:t>
-      </w:r>
-    </w:p>
-    <w:p>
-      <w:pPr>
-        <w:ind w:left="720"/>
-      </w:pPr>
-      <w:r>
-        <w:t>Figure \ref{</w:t>
+        <w:t>si</w:t>
+      </w:r>
+      <w:proofErr w:type="spellEnd"/>
+      <w:r>
+        <w:t>{\micro\metre}$ light; however, off-the-shelf detectors do not fulfil the requirements of a photodiode that can be used in the readout of a gravitational wave detector.</w:t>
+      </w:r>
+    </w:p>
+    <w:p>
+      <w:r>
+        <w:t xml:space="preserve">It is technically challenging to create Extended </w:t>
+      </w:r>
+      <w:proofErr w:type="spellStart"/>
+      <w:r>
+        <w:t>InGaAs</w:t>
+      </w:r>
+      <w:proofErr w:type="spellEnd"/>
+      <w:r>
+        <w:t xml:space="preserve"> photodiodes with high quantum efficiency due to the lattice mismatch between the </w:t>
+      </w:r>
+      <w:proofErr w:type="spellStart"/>
+      <w:r>
+        <w:t>InP</w:t>
+      </w:r>
+      <w:proofErr w:type="spellEnd"/>
+      <w:r>
+        <w:t xml:space="preserve"> substrate and the </w:t>
+      </w:r>
+      <w:proofErr w:type="spellStart"/>
+      <w:r>
+        <w:t>InGaAs</w:t>
+      </w:r>
+      <w:proofErr w:type="spellEnd"/>
+      <w:r>
+        <w:t>.</w:t>
+      </w:r>
+    </w:p>
+    <w:p>
+      <w:r>
+        <w:t xml:space="preserve">To overcome the manufacturing challenges associated with creating extended </w:t>
+      </w:r>
+      <w:proofErr w:type="spellStart"/>
+      <w:r>
+        <w:t>InGaAs</w:t>
+      </w:r>
+      <w:proofErr w:type="spellEnd"/>
+      <w:r>
+        <w:t xml:space="preserve"> photodiodes, a dedicated wafer would need to be commissioned.</w:t>
+      </w:r>
+    </w:p>
+    <w:p>
+      <w:proofErr w:type="spellStart"/>
+      <w:r>
+        <w:t>InSb</w:t>
+      </w:r>
+      <w:proofErr w:type="spellEnd"/>
+      <w:r>
+        <w:t xml:space="preserve"> detectors may also be useful as they have near unity quantum efficiency at short infra-red wavelengths, however their quantum efficiency below 2</w:t>
       </w:r>
       <w:proofErr w:type="gramStart"/>
       <w:r>
-        <w:t>fig:pdchapterfd</w:t>
-      </w:r>
+        <w:t>\,\</w:t>
+      </w:r>
+      <w:proofErr w:type="spellStart"/>
       <w:proofErr w:type="gramEnd"/>
       <w:r>
-        <w:t>10dnoisetest} shows the photocurrent measured has the noise level predicted by Equation \ref{</w:t>
-      </w:r>
-      <w:proofErr w:type="spellStart"/>
-      <w:r>
-        <w:t>eq:pd_chapter_noise_budget</w:t>
-      </w:r>
-      <w:proofErr w:type="spellEnd"/>
-      <w:r>
-        <w:t>}, meaning that the increase in photocurrent at a reverse bias voltage of 0.6V is, without doubt, an increase in quantum efficiency.</w:t>
-      </w:r>
-    </w:p>
-    <w:p>
-      <w:pPr>
-        <w:rPr>
-          <w:b/>
-          <w:bCs/>
-        </w:rPr>
-      </w:pPr>
-      <w:r>
-        <w:rPr>
-          <w:b/>
-          <w:bCs/>
-        </w:rPr>
-        <w:t xml:space="preserve">Dark Current and Dark Noise in Extended </w:t>
-      </w:r>
-      <w:proofErr w:type="spellStart"/>
-      <w:r>
-        <w:rPr>
-          <w:b/>
-          <w:bCs/>
-        </w:rPr>
-        <w:t>InGaAs</w:t>
-      </w:r>
-      <w:proofErr w:type="spellEnd"/>
-      <w:r>
-        <w:rPr>
-          <w:b/>
-          <w:bCs/>
-        </w:rPr>
-        <w:t xml:space="preserve"> Photodiodes</w:t>
-      </w:r>
-    </w:p>
-    <w:p>
-      <w:r>
-        <w:t xml:space="preserve">The dark current and dark noise of extended </w:t>
-      </w:r>
-      <w:proofErr w:type="spellStart"/>
-      <w:r>
-        <w:t>InGaAs</w:t>
-      </w:r>
-      <w:proofErr w:type="spellEnd"/>
-      <w:r>
-        <w:t xml:space="preserve"> photodiodes has been a limiting factor in previous quantum optics experiments \</w:t>
+        <w:t>si</w:t>
+      </w:r>
+      <w:proofErr w:type="spellEnd"/>
+      <w:r>
+        <w:t>{\micro\metre}  can exceed unity due to multi-electron processes \cite{Beattie1962}.</w:t>
+      </w:r>
+    </w:p>
+    <w:p>
+      <w:r>
+        <w:t>Alternative photodiode materials could be used to detect 2</w:t>
       </w:r>
       <w:proofErr w:type="gramStart"/>
       <w:r>
-        <w:t>cite{</w:t>
-      </w:r>
+        <w:t>\,\</w:t>
+      </w:r>
+      <w:proofErr w:type="spellStart"/>
       <w:proofErr w:type="gramEnd"/>
       <w:r>
-        <w:t>Mansell2018a,Yap2019}.</w:t>
-      </w:r>
-    </w:p>
-    <w:p>
-      <w:r>
-        <w:t>There is a balance to strike between the quantum efficiency and dark noise.</w:t>
-      </w:r>
-    </w:p>
-    <w:p>
-      <w:r>
-        <w:t>The noise of the current made by the photodiode can be modelled as</w:t>
-      </w:r>
-      <w:r>
-        <w:t xml:space="preserve"> [equation]</w:t>
-      </w:r>
-    </w:p>
-    <w:p>
-      <w:r>
-        <w:t xml:space="preserve">To measure the dark noise produced by the extended </w:t>
-      </w:r>
-      <w:proofErr w:type="spellStart"/>
-      <w:r>
-        <w:t>InGaAs</w:t>
-      </w:r>
-      <w:proofErr w:type="spellEnd"/>
-      <w:r>
-        <w:t xml:space="preserve"> photodiodes, a transimpedance amplifier with high gain was used.</w:t>
-      </w:r>
-    </w:p>
-    <w:p>
-      <w:pPr>
-        <w:ind w:firstLine="720"/>
-        <w:rPr>
-          <w:b/>
-          <w:bCs/>
-        </w:rPr>
-      </w:pPr>
-      <w:r>
-        <w:rPr>
-          <w:b/>
-          <w:bCs/>
-        </w:rPr>
-        <w:t>Room Temperature</w:t>
-      </w:r>
-    </w:p>
-    <w:p>
-      <w:pPr>
-        <w:ind w:left="720"/>
-      </w:pPr>
-      <w:r>
-        <w:t>The dark noise as a function of bias for the photodiodes listed in table \</w:t>
-      </w:r>
-      <w:proofErr w:type="gramStart"/>
-      <w:r>
-        <w:t>ref{</w:t>
-      </w:r>
-      <w:proofErr w:type="gramEnd"/>
-      <w:r>
-        <w:t>} was measured at room temperature ($\sim20\</w:t>
-      </w:r>
-      <w:proofErr w:type="spellStart"/>
-      <w:r>
         <w:t>si</w:t>
       </w:r>
       <w:proofErr w:type="spellEnd"/>
       <w:r>
-        <w:t>{\</w:t>
-      </w:r>
-      <w:proofErr w:type="spellStart"/>
-      <w:r>
-        <w:t>degreeCelsius</w:t>
-      </w:r>
-      <w:proofErr w:type="spellEnd"/>
-      <w:r>
-        <w:t>}$)</w:t>
-      </w:r>
-    </w:p>
-    <w:p>
-      <w:pPr>
-        <w:ind w:left="720"/>
-      </w:pPr>
-      <w:r>
-        <w:lastRenderedPageBreak/>
-        <w:t>The dark noise at 10</w:t>
-      </w:r>
-      <w:proofErr w:type="gramStart"/>
-      <w:r>
-        <w:t>\,Hz</w:t>
-      </w:r>
-      <w:proofErr w:type="gramEnd"/>
-      <w:r>
-        <w:t xml:space="preserve"> and the dark current as a function of bias for each diode is shown in Figure \ref{</w:t>
-      </w:r>
-      <w:proofErr w:type="spellStart"/>
-      <w:r>
-        <w:t>fig:pdchapterdarkcurrentmegaplot</w:t>
-      </w:r>
-      <w:proofErr w:type="spellEnd"/>
-      <w:r>
-        <w:t>}.</w:t>
-      </w:r>
-    </w:p>
-    <w:p>
-      <w:pPr>
-        <w:ind w:left="720"/>
-      </w:pPr>
-      <w:r>
-        <w:t>Where there were duplicate diodes to choose from, the superior diode was selected for characterisation.</w:t>
-      </w:r>
-    </w:p>
-    <w:p>
-      <w:pPr>
-        <w:ind w:firstLine="720"/>
-        <w:rPr>
-          <w:b/>
-          <w:bCs/>
-        </w:rPr>
-      </w:pPr>
-      <w:r>
-        <w:rPr>
-          <w:b/>
-          <w:bCs/>
-        </w:rPr>
-        <w:t>Cooling Experiment</w:t>
-      </w:r>
-    </w:p>
-    <w:p>
-      <w:pPr>
-        <w:ind w:left="720"/>
-      </w:pPr>
-      <w:r>
-        <w:t xml:space="preserve">The typical low temperature damage threshold for extended </w:t>
-      </w:r>
-      <w:proofErr w:type="spellStart"/>
-      <w:r>
-        <w:t>InGaAs</w:t>
-      </w:r>
-      <w:proofErr w:type="spellEnd"/>
-      <w:r>
-        <w:t xml:space="preserve"> photodiodes is \SI{-</w:t>
-      </w:r>
-      <w:proofErr w:type="gramStart"/>
-      <w:r>
-        <w:t>40}{</w:t>
-      </w:r>
-      <w:proofErr w:type="gramEnd"/>
-      <w:r>
-        <w:t>\</w:t>
-      </w:r>
-      <w:proofErr w:type="spellStart"/>
-      <w:r>
-        <w:t>degreeCelsius</w:t>
-      </w:r>
-      <w:proofErr w:type="spellEnd"/>
-      <w:r>
-        <w:t>}.</w:t>
-      </w:r>
-    </w:p>
-    <w:p>
-      <w:pPr>
-        <w:ind w:left="720"/>
-      </w:pPr>
-      <w:r>
-        <w:t>The dark noise and dark current for each diode in Table \</w:t>
-      </w:r>
-      <w:proofErr w:type="gramStart"/>
-      <w:r>
-        <w:t>ref{</w:t>
-      </w:r>
-      <w:proofErr w:type="gramEnd"/>
-      <w:r>
-        <w:t>} was measured at the diode's maximum reverse bias specified in the data sheet.</w:t>
-      </w:r>
-    </w:p>
-    <w:p>
-      <w:pPr>
-        <w:rPr>
-          <w:b/>
-          <w:bCs/>
-        </w:rPr>
-      </w:pPr>
-      <w:r>
-        <w:rPr>
-          <w:b/>
-          <w:bCs/>
-        </w:rPr>
-        <w:t xml:space="preserve">Saturation Limit for some laser components </w:t>
-      </w:r>
-      <w:r>
-        <w:rPr>
-          <w:b/>
-          <w:bCs/>
-        </w:rPr>
-        <w:t xml:space="preserve">Extended </w:t>
-      </w:r>
-      <w:proofErr w:type="spellStart"/>
-      <w:r>
-        <w:rPr>
-          <w:b/>
-          <w:bCs/>
-        </w:rPr>
-        <w:t>InGaAs</w:t>
-      </w:r>
-      <w:proofErr w:type="spellEnd"/>
-      <w:r>
-        <w:rPr>
-          <w:b/>
-          <w:bCs/>
-        </w:rPr>
-        <w:t xml:space="preserve"> </w:t>
-      </w:r>
-      <w:r>
-        <w:rPr>
-          <w:b/>
-          <w:bCs/>
-        </w:rPr>
-        <w:t>photodiodes</w:t>
-      </w:r>
-    </w:p>
-    <w:p>
-      <w:r>
-        <w:t xml:space="preserve">The laser components diodes were found to saturate at low powers if they were biased with a </w:t>
-      </w:r>
-      <w:proofErr w:type="gramStart"/>
-      <w:r>
-        <w:t>low enough voltages</w:t>
-      </w:r>
-      <w:proofErr w:type="gramEnd"/>
-      <w:r>
-        <w:t xml:space="preserve"> such that their dark noise was below the noise target</w:t>
-      </w:r>
-    </w:p>
-    <w:p>
-      <w:pPr>
-        <w:rPr>
-          <w:b/>
-          <w:bCs/>
-        </w:rPr>
-      </w:pPr>
-      <w:r>
-        <w:rPr>
-          <w:b/>
-          <w:bCs/>
-        </w:rPr>
-        <w:t xml:space="preserve">Forward Bias Characteristics of an Extended </w:t>
-      </w:r>
-      <w:proofErr w:type="spellStart"/>
-      <w:r>
-        <w:rPr>
-          <w:b/>
-          <w:bCs/>
-        </w:rPr>
-        <w:t>InGaAs</w:t>
-      </w:r>
-      <w:proofErr w:type="spellEnd"/>
-      <w:r>
-        <w:rPr>
-          <w:b/>
-          <w:bCs/>
-        </w:rPr>
-        <w:t xml:space="preserve"> Photodiode</w:t>
-      </w:r>
-    </w:p>
-    <w:p>
-      <w:pPr>
-        <w:rPr>
-          <w:b/>
-          <w:bCs/>
-        </w:rPr>
-      </w:pPr>
-    </w:p>
-    <w:p>
-      <w:pPr>
-        <w:rPr>
-          <w:b/>
-          <w:bCs/>
-        </w:rPr>
-      </w:pPr>
-      <w:proofErr w:type="spellStart"/>
-      <w:r>
-        <w:rPr>
-          <w:b/>
-          <w:bCs/>
-        </w:rPr>
-        <w:t>InSb</w:t>
-      </w:r>
-      <w:proofErr w:type="spellEnd"/>
-      <w:r>
-        <w:rPr>
-          <w:b/>
-          <w:bCs/>
-        </w:rPr>
-        <w:t xml:space="preserve"> testing</w:t>
-      </w:r>
-    </w:p>
-    <w:p>
-      <w:pPr>
-        <w:rPr>
-          <w:b/>
-          <w:bCs/>
-        </w:rPr>
-      </w:pPr>
-      <w:r>
-        <w:rPr>
-          <w:b/>
-          <w:bCs/>
-        </w:rPr>
-        <w:t>Discussion</w:t>
-      </w:r>
-    </w:p>
-    <w:p>
-      <w:pPr>
-        <w:rPr>
-          <w:b/>
-          <w:bCs/>
-        </w:rPr>
-      </w:pPr>
-      <w:r>
-        <w:rPr>
-          <w:b/>
-          <w:bCs/>
-        </w:rPr>
-        <w:t>Conclusion</w:t>
-      </w:r>
+        <w:t>{\micro\meter} light.</w:t>
+      </w:r>
+    </w:p>
+    <w:p/>
+    <w:p>
+      <w:pPr>
+        <w:rPr>
+          <w:b/>
+          <w:bCs/>
+        </w:rPr>
+      </w:pPr>
+      <w:r>
+        <w:rPr>
+          <w:b/>
+          <w:bCs/>
+        </w:rPr>
+        <w:t>Notes for editing:</w:t>
+      </w:r>
+    </w:p>
+    <w:p>
+      <w:pPr>
+        <w:pStyle w:val="ListParagraph"/>
+        <w:numPr>
+          <w:ilvl w:val="0"/>
+          <w:numId w:val="6"/>
+        </w:numPr>
+      </w:pPr>
+      <w:r>
+        <w:t>Take note of when defects, traps etc are mentioned</w:t>
+      </w:r>
+    </w:p>
+    <w:p>
+      <w:pPr>
+        <w:pStyle w:val="ListParagraph"/>
+        <w:numPr>
+          <w:ilvl w:val="0"/>
+          <w:numId w:val="6"/>
+        </w:numPr>
+      </w:pPr>
+      <w:r>
+        <w:t xml:space="preserve">Remove </w:t>
+      </w:r>
+      <w:r>
+        <w:t>mentions of volume relating to dark noise, defects may be driven by surface area of the device.</w:t>
+      </w:r>
+    </w:p>
+    <w:p>
+      <w:pPr>
+        <w:pStyle w:val="ListParagraph"/>
+        <w:numPr>
+          <w:ilvl w:val="0"/>
+          <w:numId w:val="6"/>
+        </w:numPr>
+      </w:pPr>
+      <w:r>
+        <w:t>Look out for repetition.</w:t>
+      </w:r>
+    </w:p>
+    <w:p>
+      <w:pPr>
+        <w:pStyle w:val="ListParagraph"/>
+      </w:pPr>
     </w:p>
     <w:sectPr>
       <w:pgSz w:w="11906" w:h="16838"/>
@@ -1476,7 +1912,7 @@
   <w:abstractNum w:abstractNumId="1" w15:restartNumberingAfterBreak="0">
     <w:nsid w:val="0EAA409D"/>
     <w:multiLevelType w:val="hybridMultilevel"/>
-    <w:tmpl w:val="1E5E5500"/>
+    <w:tmpl w:val="94F87EF4"/>
     <w:lvl w:ilvl="0" w:tplc="08090001">
       <w:start w:val="1"/>
       <w:numFmt w:val="bullet"/>

</xml_diff>

<commit_message>
finished adding kens edits to the photodiode chapter (except for data sheet refeerences)
</commit_message>
<xml_diff>
--- a/Structuring photodiode chapter.docx
+++ b/Structuring photodiode chapter.docx
@@ -8,6 +8,27 @@
       </w:r>
     </w:p>
     <w:p/>
+    <w:p/>
+    <w:p>
+      <w:r>
+        <w:t xml:space="preserve">Ge is sometimes used as a substrate. This will be lattice matched for InGaAs with an </w:t>
+      </w:r>
+      <w:proofErr w:type="gramStart"/>
+      <w:r>
+        <w:t>In</w:t>
+      </w:r>
+      <w:proofErr w:type="gramEnd"/>
+      <w:r>
+        <w:t xml:space="preserve"> content around 10\%; this corresponds to the bandgap energy similar to the energy of a 1</w:t>
+      </w:r>
+      <w:r>
+        <w:t>um</w:t>
+      </w:r>
+      <w:r>
+        <w:t xml:space="preserve"> photon.</w:t>
+      </w:r>
+    </w:p>
+    <w:p/>
     <w:p>
       <w:r>
         <w:t>Introduction:</w:t>
@@ -30,9 +51,11 @@
       <w:r>
         <w:t xml:space="preserve"> </w:t>
       </w:r>
+      <w:proofErr w:type="spellStart"/>
       <w:r>
         <w:t>InSb</w:t>
       </w:r>
+      <w:proofErr w:type="spellEnd"/>
       <w:r>
         <w:t>?</w:t>
       </w:r>
@@ -55,7 +78,15 @@
         </w:numPr>
       </w:pPr>
       <w:r>
-        <w:t>Limitation in previous work was the quality of the PD</w:t>
+        <w:t xml:space="preserve">Limitation in </w:t>
+      </w:r>
+      <w:proofErr w:type="gramStart"/>
+      <w:r>
+        <w:t>previous</w:t>
+      </w:r>
+      <w:proofErr w:type="gramEnd"/>
+      <w:r>
+        <w:t xml:space="preserve"> work was the quality of the PD</w:t>
       </w:r>
       <w:r>
         <w:t>?</w:t>
@@ -87,8 +118,13 @@
     </w:p>
     <w:p>
       <w:r>
-        <w:t>What is an extended InGaAs photodiode:</w:t>
-      </w:r>
+        <w:t xml:space="preserve">What is an extended InGaAs </w:t>
+      </w:r>
+      <w:proofErr w:type="gramStart"/>
+      <w:r>
+        <w:t>photodiode:</w:t>
+      </w:r>
+      <w:proofErr w:type="gramEnd"/>
     </w:p>
     <w:p>
       <w:pPr>
@@ -132,12 +168,25 @@
         <w:t>exists</w:t>
       </w:r>
       <w:r>
-        <w:t xml:space="preserve"> in commercial PDs</w:t>
-      </w:r>
-    </w:p>
-    <w:p>
-      <w:r>
-        <w:t>‘What is needed from a photodiode in a gw detector?’ section:</w:t>
+        <w:t xml:space="preserve"> in commercial </w:t>
+      </w:r>
+      <w:proofErr w:type="gramStart"/>
+      <w:r>
+        <w:t>PDs</w:t>
+      </w:r>
+      <w:proofErr w:type="gramEnd"/>
+    </w:p>
+    <w:p>
+      <w:r>
+        <w:t xml:space="preserve">‘What is needed from a photodiode in a </w:t>
+      </w:r>
+      <w:proofErr w:type="spellStart"/>
+      <w:r>
+        <w:t>gw</w:t>
+      </w:r>
+      <w:proofErr w:type="spellEnd"/>
+      <w:r>
+        <w:t xml:space="preserve"> detector?’ section:</w:t>
       </w:r>
     </w:p>
     <w:p>
@@ -194,15 +243,31 @@
         <w:t>Handle ~10mW of light</w:t>
       </w:r>
       <w:r>
-        <w:t xml:space="preserve"> i.e. linear</w:t>
-      </w:r>
-    </w:p>
-    <w:p>
-      <w:pPr>
-        <w:pStyle w:val="ListParagraph"/>
-      </w:pPr>
-      <w:r>
-        <w:t>This means we have to do &lt;list of  measurements that will be mentioned in chapter&gt;</w:t>
+        <w:t xml:space="preserve"> </w:t>
+      </w:r>
+      <w:proofErr w:type="gramStart"/>
+      <w:r>
+        <w:t>i.e.</w:t>
+      </w:r>
+      <w:proofErr w:type="gramEnd"/>
+      <w:r>
+        <w:t xml:space="preserve"> linear</w:t>
+      </w:r>
+    </w:p>
+    <w:p>
+      <w:pPr>
+        <w:pStyle w:val="ListParagraph"/>
+      </w:pPr>
+      <w:r>
+        <w:t xml:space="preserve">This means we have to do &lt;list </w:t>
+      </w:r>
+      <w:proofErr w:type="gramStart"/>
+      <w:r>
+        <w:t>of  measurements</w:t>
+      </w:r>
+      <w:proofErr w:type="gramEnd"/>
+      <w:r>
+        <w:t xml:space="preserve"> that will be mentioned in chapter&gt;</w:t>
       </w:r>
     </w:p>
     <w:p>
@@ -321,8 +386,13 @@
         </w:numPr>
       </w:pPr>
       <w:r>
-        <w:t>High QE needs high bias</w:t>
-      </w:r>
+        <w:t xml:space="preserve">High QE needs high </w:t>
+      </w:r>
+      <w:proofErr w:type="gramStart"/>
+      <w:r>
+        <w:t>bias</w:t>
+      </w:r>
+      <w:proofErr w:type="gramEnd"/>
     </w:p>
     <w:p>
       <w:pPr>
@@ -333,8 +403,13 @@
         </w:numPr>
       </w:pPr>
       <w:r>
-        <w:t>Linearity needs high bias</w:t>
-      </w:r>
+        <w:t xml:space="preserve">Linearity needs high </w:t>
+      </w:r>
+      <w:proofErr w:type="gramStart"/>
+      <w:r>
+        <w:t>bias</w:t>
+      </w:r>
+      <w:proofErr w:type="gramEnd"/>
     </w:p>
     <w:p>
       <w:pPr>
@@ -345,8 +420,13 @@
         </w:numPr>
       </w:pPr>
       <w:r>
-        <w:t>But high bias leads to noise</w:t>
-      </w:r>
+        <w:t xml:space="preserve">But high bias leads to </w:t>
+      </w:r>
+      <w:proofErr w:type="gramStart"/>
+      <w:r>
+        <w:t>noise</w:t>
+      </w:r>
+      <w:proofErr w:type="gramEnd"/>
     </w:p>
     <w:p>
       <w:pPr>
@@ -377,6 +457,7 @@
         </w:numPr>
       </w:pPr>
       <w:r>
+        <w:lastRenderedPageBreak/>
         <w:t xml:space="preserve">To fix this problem, InGaAs needs to be grown slowly to avoid lattice defects which give rise to 1/f noise. Commercially available photodiodes are not made this way, it would take a large </w:t>
       </w:r>
       <w:r>
@@ -393,6 +474,954 @@
       </w:r>
     </w:p>
     <w:p/>
+    <w:p>
+      <w:pPr>
+        <w:pStyle w:val="ListParagraph"/>
+        <w:ind w:left="0"/>
+        <w:rPr>
+          <w:u w:val="single"/>
+        </w:rPr>
+      </w:pPr>
+      <w:r>
+        <w:rPr>
+          <w:u w:val="single"/>
+        </w:rPr>
+        <w:t>Intro bit</w:t>
+      </w:r>
+    </w:p>
+    <w:p>
+      <w:pPr>
+        <w:pStyle w:val="ListParagraph"/>
+        <w:ind w:left="0"/>
+        <w:rPr>
+          <w:u w:val="single"/>
+        </w:rPr>
+      </w:pPr>
+    </w:p>
+    <w:p>
+      <w:pPr>
+        <w:pStyle w:val="ListParagraph"/>
+        <w:ind w:left="0"/>
+      </w:pPr>
+      <w:proofErr w:type="gramStart"/>
+      <w:r>
+        <w:t>Sign post</w:t>
+      </w:r>
+      <w:r>
+        <w:t>s</w:t>
+      </w:r>
+      <w:proofErr w:type="gramEnd"/>
+      <w:r>
+        <w:t>. B</w:t>
+      </w:r>
+      <w:r>
+        <w:t>asic introduction</w:t>
+      </w:r>
+      <w:r>
+        <w:t xml:space="preserve"> of what is important</w:t>
+      </w:r>
+      <w:r>
+        <w:t xml:space="preserve"> and what was </w:t>
+      </w:r>
+      <w:proofErr w:type="gramStart"/>
+      <w:r>
+        <w:t>done</w:t>
+      </w:r>
+      <w:proofErr w:type="gramEnd"/>
+    </w:p>
+    <w:p>
+      <w:pPr>
+        <w:pStyle w:val="ListParagraph"/>
+        <w:ind w:left="0"/>
+      </w:pPr>
+    </w:p>
+    <w:p>
+      <w:pPr>
+        <w:pStyle w:val="ListParagraph"/>
+        <w:ind w:left="0"/>
+        <w:rPr>
+          <w:u w:val="single"/>
+        </w:rPr>
+      </w:pPr>
+      <w:r>
+        <w:rPr>
+          <w:u w:val="single"/>
+        </w:rPr>
+        <w:t>8.1</w:t>
+      </w:r>
+    </w:p>
+    <w:p>
+      <w:pPr>
+        <w:pStyle w:val="ListParagraph"/>
+        <w:ind w:left="0"/>
+      </w:pPr>
+    </w:p>
+    <w:p>
+      <w:pPr>
+        <w:pStyle w:val="ListParagraph"/>
+        <w:ind w:left="0"/>
+      </w:pPr>
+      <w:r>
+        <w:t>QE</w:t>
+      </w:r>
+      <w:r>
+        <w:t xml:space="preserve"> req.</w:t>
+      </w:r>
+    </w:p>
+    <w:p>
+      <w:pPr>
+        <w:pStyle w:val="ListParagraph"/>
+        <w:ind w:left="0"/>
+      </w:pPr>
+    </w:p>
+    <w:p>
+      <w:pPr>
+        <w:pStyle w:val="ListParagraph"/>
+        <w:ind w:left="0"/>
+      </w:pPr>
+      <w:r>
+        <w:t>Light handling req.</w:t>
+      </w:r>
+    </w:p>
+    <w:p>
+      <w:pPr>
+        <w:pStyle w:val="ListParagraph"/>
+        <w:ind w:left="0"/>
+      </w:pPr>
+    </w:p>
+    <w:p>
+      <w:pPr>
+        <w:pStyle w:val="ListParagraph"/>
+        <w:ind w:left="0"/>
+      </w:pPr>
+      <w:r>
+        <w:t>Noise req.</w:t>
+      </w:r>
+    </w:p>
+    <w:p>
+      <w:pPr>
+        <w:pStyle w:val="ListParagraph"/>
+        <w:ind w:left="0"/>
+      </w:pPr>
+    </w:p>
+    <w:p>
+      <w:pPr>
+        <w:pStyle w:val="ListParagraph"/>
+        <w:ind w:left="0"/>
+      </w:pPr>
+      <w:r>
+        <w:t xml:space="preserve">Discussion of why heterodyne </w:t>
+      </w:r>
+      <w:proofErr w:type="spellStart"/>
+      <w:r>
+        <w:t>wont</w:t>
+      </w:r>
+      <w:proofErr w:type="spellEnd"/>
+      <w:r>
+        <w:t xml:space="preserve"> work.</w:t>
+      </w:r>
+    </w:p>
+    <w:p>
+      <w:pPr>
+        <w:pStyle w:val="ListParagraph"/>
+        <w:ind w:left="0"/>
+        <w:rPr>
+          <w:u w:val="single"/>
+        </w:rPr>
+      </w:pPr>
+    </w:p>
+    <w:p>
+      <w:pPr>
+        <w:pStyle w:val="ListParagraph"/>
+        <w:ind w:left="0"/>
+        <w:rPr>
+          <w:u w:val="single"/>
+        </w:rPr>
+      </w:pPr>
+      <w:r>
+        <w:rPr>
+          <w:u w:val="single"/>
+        </w:rPr>
+        <w:t>8.2</w:t>
+      </w:r>
+    </w:p>
+    <w:p>
+      <w:pPr>
+        <w:pStyle w:val="ListParagraph"/>
+        <w:ind w:left="0"/>
+        <w:rPr>
+          <w:u w:val="single"/>
+        </w:rPr>
+      </w:pPr>
+    </w:p>
+    <w:p>
+      <w:pPr>
+        <w:pStyle w:val="ListParagraph"/>
+        <w:ind w:left="0"/>
+      </w:pPr>
+      <w:proofErr w:type="gramStart"/>
+      <w:r>
+        <w:t>Sign post</w:t>
+      </w:r>
+      <w:proofErr w:type="gramEnd"/>
+      <w:r>
+        <w:t xml:space="preserve"> and basic intro.</w:t>
+      </w:r>
+    </w:p>
+    <w:p>
+      <w:pPr>
+        <w:pStyle w:val="ListParagraph"/>
+        <w:ind w:left="0"/>
+      </w:pPr>
+    </w:p>
+    <w:p>
+      <w:pPr>
+        <w:pStyle w:val="ListParagraph"/>
+        <w:ind w:left="0"/>
+      </w:pPr>
+      <w:r>
+        <w:t>PN diode explanation</w:t>
+      </w:r>
+    </w:p>
+    <w:p>
+      <w:pPr>
+        <w:pStyle w:val="ListParagraph"/>
+        <w:ind w:left="0"/>
+      </w:pPr>
+    </w:p>
+    <w:p>
+      <w:pPr>
+        <w:pStyle w:val="ListParagraph"/>
+        <w:ind w:left="0"/>
+      </w:pPr>
+      <w:r>
+        <w:t xml:space="preserve">Photon </w:t>
+      </w:r>
+      <w:r>
+        <w:t>absorption in diode + depletion region</w:t>
+      </w:r>
+    </w:p>
+    <w:p>
+      <w:pPr>
+        <w:pStyle w:val="ListParagraph"/>
+        <w:ind w:left="0"/>
+      </w:pPr>
+    </w:p>
+    <w:p>
+      <w:pPr>
+        <w:pStyle w:val="ListParagraph"/>
+        <w:ind w:left="0"/>
+      </w:pPr>
+      <w:r>
+        <w:t xml:space="preserve">Widen depletion region with </w:t>
+      </w:r>
+      <w:proofErr w:type="gramStart"/>
+      <w:r>
+        <w:t>bias</w:t>
+      </w:r>
+      <w:proofErr w:type="gramEnd"/>
+    </w:p>
+    <w:p>
+      <w:pPr>
+        <w:pStyle w:val="ListParagraph"/>
+        <w:ind w:left="0"/>
+      </w:pPr>
+    </w:p>
+    <w:p>
+      <w:pPr>
+        <w:pStyle w:val="ListParagraph"/>
+        <w:ind w:left="0"/>
+      </w:pPr>
+      <w:r>
+        <w:t xml:space="preserve">Widen depletion region with intrinsic </w:t>
+      </w:r>
+      <w:proofErr w:type="gramStart"/>
+      <w:r>
+        <w:t>layer</w:t>
+      </w:r>
+      <w:proofErr w:type="gramEnd"/>
+    </w:p>
+    <w:p>
+      <w:pPr>
+        <w:pStyle w:val="ListParagraph"/>
+        <w:ind w:left="0"/>
+      </w:pPr>
+    </w:p>
+    <w:p>
+      <w:pPr>
+        <w:pStyle w:val="ListParagraph"/>
+        <w:ind w:left="0"/>
+      </w:pPr>
+      <w:r>
+        <w:t xml:space="preserve">What </w:t>
+      </w:r>
+      <w:proofErr w:type="spellStart"/>
+      <w:r>
+        <w:t>ingaas</w:t>
+      </w:r>
+      <w:proofErr w:type="spellEnd"/>
+      <w:r>
+        <w:t xml:space="preserve"> is.</w:t>
+      </w:r>
+    </w:p>
+    <w:p>
+      <w:pPr>
+        <w:pStyle w:val="ListParagraph"/>
+        <w:ind w:left="0"/>
+      </w:pPr>
+    </w:p>
+    <w:p>
+      <w:pPr>
+        <w:pStyle w:val="ListParagraph"/>
+        <w:ind w:left="0"/>
+      </w:pPr>
+      <w:r>
+        <w:t xml:space="preserve">Making </w:t>
+      </w:r>
+      <w:proofErr w:type="spellStart"/>
+      <w:r>
+        <w:t>ingaas</w:t>
+      </w:r>
+      <w:proofErr w:type="spellEnd"/>
+      <w:r>
+        <w:t xml:space="preserve"> extended</w:t>
+      </w:r>
+    </w:p>
+    <w:p>
+      <w:pPr>
+        <w:pStyle w:val="ListParagraph"/>
+        <w:ind w:left="0"/>
+      </w:pPr>
+    </w:p>
+    <w:p>
+      <w:pPr>
+        <w:pStyle w:val="ListParagraph"/>
+        <w:ind w:left="0"/>
+      </w:pPr>
+      <w:r>
+        <w:t>Defects in extended InGaAs</w:t>
+      </w:r>
+      <w:r>
+        <w:t xml:space="preserve"> that is thick enough to have good </w:t>
+      </w:r>
+      <w:proofErr w:type="spellStart"/>
+      <w:r>
+        <w:t>qe</w:t>
+      </w:r>
+      <w:proofErr w:type="spellEnd"/>
+      <w:r>
+        <w:t>.</w:t>
+      </w:r>
+    </w:p>
+    <w:p>
+      <w:pPr>
+        <w:pStyle w:val="ListParagraph"/>
+        <w:ind w:left="0"/>
+      </w:pPr>
+    </w:p>
+    <w:p>
+      <w:pPr>
+        <w:pStyle w:val="ListParagraph"/>
+        <w:ind w:left="0"/>
+      </w:pPr>
+      <w:r>
+        <w:t>Wh</w:t>
+      </w:r>
+      <w:r>
+        <w:t>at is a defect.</w:t>
+      </w:r>
+    </w:p>
+    <w:p>
+      <w:pPr>
+        <w:pStyle w:val="ListParagraph"/>
+        <w:ind w:left="0"/>
+      </w:pPr>
+    </w:p>
+    <w:p>
+      <w:pPr>
+        <w:pStyle w:val="ListParagraph"/>
+        <w:ind w:left="0"/>
+      </w:pPr>
+      <w:r>
+        <w:t>AR coating.</w:t>
+      </w:r>
+    </w:p>
+    <w:p>
+      <w:pPr>
+        <w:pStyle w:val="ListParagraph"/>
+        <w:ind w:left="0"/>
+      </w:pPr>
+    </w:p>
+    <w:p>
+      <w:pPr>
+        <w:pStyle w:val="ListParagraph"/>
+        <w:ind w:left="0"/>
+      </w:pPr>
+      <w:r>
+        <w:t>Dark noise and dark current.</w:t>
+      </w:r>
+    </w:p>
+    <w:p>
+      <w:pPr>
+        <w:pStyle w:val="ListParagraph"/>
+        <w:ind w:left="0"/>
+      </w:pPr>
+    </w:p>
+    <w:p>
+      <w:pPr>
+        <w:pStyle w:val="ListParagraph"/>
+        <w:ind w:left="0"/>
+      </w:pPr>
+      <w:r>
+        <w:t>Noise formula.</w:t>
+      </w:r>
+    </w:p>
+    <w:p>
+      <w:pPr>
+        <w:pStyle w:val="ListParagraph"/>
+        <w:ind w:left="0"/>
+      </w:pPr>
+    </w:p>
+    <w:p>
+      <w:pPr>
+        <w:pStyle w:val="ListParagraph"/>
+        <w:ind w:left="0"/>
+        <w:rPr>
+          <w:u w:val="single"/>
+        </w:rPr>
+      </w:pPr>
+      <w:r>
+        <w:rPr>
+          <w:u w:val="single"/>
+        </w:rPr>
+        <w:t>8.3</w:t>
+      </w:r>
+    </w:p>
+    <w:p>
+      <w:pPr>
+        <w:pStyle w:val="ListParagraph"/>
+        <w:ind w:left="0"/>
+        <w:rPr>
+          <w:u w:val="single"/>
+        </w:rPr>
+      </w:pPr>
+    </w:p>
+    <w:p>
+      <w:pPr>
+        <w:pStyle w:val="ListParagraph"/>
+        <w:ind w:left="0"/>
+      </w:pPr>
+      <w:r>
+        <w:t xml:space="preserve">Dark noise was </w:t>
+      </w:r>
+      <w:proofErr w:type="gramStart"/>
+      <w:r>
+        <w:t>tested</w:t>
+      </w:r>
+      <w:proofErr w:type="gramEnd"/>
+      <w:r>
+        <w:t xml:space="preserve"> in </w:t>
+      </w:r>
+      <w:r>
+        <w:t>commercially available PDS. (repeated?).</w:t>
+      </w:r>
+      <w:r>
+        <w:t xml:space="preserve"> What was measured in each </w:t>
+      </w:r>
+      <w:proofErr w:type="gramStart"/>
+      <w:r>
+        <w:t>PD.</w:t>
+      </w:r>
+      <w:proofErr w:type="gramEnd"/>
+      <w:r>
+        <w:t xml:space="preserve"> </w:t>
+      </w:r>
+    </w:p>
+    <w:p>
+      <w:pPr>
+        <w:pStyle w:val="ListParagraph"/>
+        <w:ind w:left="0"/>
+      </w:pPr>
+    </w:p>
+    <w:p>
+      <w:pPr>
+        <w:pStyle w:val="ListParagraph"/>
+        <w:ind w:left="0"/>
+        <w:rPr>
+          <w:u w:val="single"/>
+        </w:rPr>
+      </w:pPr>
+      <w:r>
+        <w:rPr>
+          <w:u w:val="single"/>
+        </w:rPr>
+        <w:t>8.4</w:t>
+      </w:r>
+    </w:p>
+    <w:p>
+      <w:pPr>
+        <w:pStyle w:val="ListParagraph"/>
+        <w:ind w:left="0"/>
+      </w:pPr>
+    </w:p>
+    <w:p>
+      <w:pPr>
+        <w:pStyle w:val="ListParagraph"/>
+        <w:ind w:left="0"/>
+      </w:pPr>
+      <w:r>
+        <w:t>What was</w:t>
+      </w:r>
+      <w:r>
+        <w:t xml:space="preserve"> measured</w:t>
+      </w:r>
+      <w:r>
+        <w:t xml:space="preserve"> + </w:t>
+      </w:r>
+      <w:proofErr w:type="gramStart"/>
+      <w:r>
+        <w:t>sign posts</w:t>
+      </w:r>
+      <w:proofErr w:type="gramEnd"/>
+      <w:r>
+        <w:t xml:space="preserve"> to method and main result.</w:t>
+      </w:r>
+    </w:p>
+    <w:p>
+      <w:pPr>
+        <w:pStyle w:val="ListParagraph"/>
+        <w:ind w:left="0"/>
+      </w:pPr>
+      <w:r>
+        <w:t>8.4.1</w:t>
+      </w:r>
+    </w:p>
+    <w:p>
+      <w:pPr>
+        <w:pStyle w:val="ListParagraph"/>
+        <w:ind w:left="0"/>
+      </w:pPr>
+    </w:p>
+    <w:p>
+      <w:pPr>
+        <w:pStyle w:val="ListParagraph"/>
+        <w:ind w:left="0"/>
+      </w:pPr>
+      <w:r>
+        <w:t>The two measurement styles</w:t>
+      </w:r>
+    </w:p>
+    <w:p>
+      <w:pPr>
+        <w:pStyle w:val="ListParagraph"/>
+        <w:ind w:left="0"/>
+      </w:pPr>
+    </w:p>
+    <w:p>
+      <w:pPr>
+        <w:pStyle w:val="ListParagraph"/>
+        <w:ind w:left="0"/>
+      </w:pPr>
+      <w:r>
+        <w:t>Why shot noise needs to be measured</w:t>
+      </w:r>
+      <w:r>
+        <w:t>, and what you need to do this.</w:t>
+      </w:r>
+    </w:p>
+    <w:p>
+      <w:pPr>
+        <w:pStyle w:val="ListParagraph"/>
+        <w:ind w:left="0"/>
+      </w:pPr>
+    </w:p>
+    <w:p>
+      <w:pPr>
+        <w:pStyle w:val="ListParagraph"/>
+        <w:ind w:left="0"/>
+      </w:pPr>
+      <w:r>
+        <w:t>TIA description</w:t>
+      </w:r>
+    </w:p>
+    <w:p>
+      <w:pPr>
+        <w:pStyle w:val="ListParagraph"/>
+        <w:ind w:left="0"/>
+      </w:pPr>
+    </w:p>
+    <w:p>
+      <w:pPr>
+        <w:pStyle w:val="ListParagraph"/>
+        <w:ind w:left="0"/>
+      </w:pPr>
+      <w:r>
+        <w:t>optics and laser description</w:t>
+      </w:r>
+    </w:p>
+    <w:p>
+      <w:pPr>
+        <w:pStyle w:val="ListParagraph"/>
+        <w:ind w:left="0"/>
+      </w:pPr>
+    </w:p>
+    <w:p>
+      <w:pPr>
+        <w:pStyle w:val="ListParagraph"/>
+        <w:ind w:left="0"/>
+      </w:pPr>
+      <w:r>
+        <w:t>Beam parameter description</w:t>
+      </w:r>
+    </w:p>
+    <w:p>
+      <w:pPr>
+        <w:pStyle w:val="ListParagraph"/>
+        <w:ind w:left="0"/>
+      </w:pPr>
+    </w:p>
+    <w:p>
+      <w:pPr>
+        <w:pStyle w:val="ListParagraph"/>
+        <w:ind w:left="0"/>
+      </w:pPr>
+      <w:r>
+        <w:t xml:space="preserve">How </w:t>
+      </w:r>
+      <w:r>
+        <w:t>the noise was measured.</w:t>
+      </w:r>
+    </w:p>
+    <w:p>
+      <w:pPr>
+        <w:pStyle w:val="ListParagraph"/>
+        <w:ind w:left="0"/>
+      </w:pPr>
+    </w:p>
+    <w:p>
+      <w:pPr>
+        <w:pStyle w:val="ListParagraph"/>
+        <w:ind w:left="0"/>
+      </w:pPr>
+      <w:r>
+        <w:t>Calibration of measurements with 1111</w:t>
+      </w:r>
+      <w:r>
+        <w:t xml:space="preserve"> kHz peak.</w:t>
+      </w:r>
+    </w:p>
+    <w:p>
+      <w:pPr>
+        <w:pStyle w:val="ListParagraph"/>
+        <w:ind w:left="0"/>
+      </w:pPr>
+    </w:p>
+    <w:p>
+      <w:pPr>
+        <w:pStyle w:val="ListParagraph"/>
+        <w:ind w:left="0"/>
+        <w:rPr>
+          <w:u w:val="single"/>
+        </w:rPr>
+      </w:pPr>
+      <w:r>
+        <w:rPr>
+          <w:u w:val="single"/>
+        </w:rPr>
+        <w:t>8.4.2</w:t>
+      </w:r>
+    </w:p>
+    <w:p>
+      <w:pPr>
+        <w:pStyle w:val="ListParagraph"/>
+        <w:ind w:left="0"/>
+      </w:pPr>
+      <w:r>
+        <w:t xml:space="preserve">What effect increasing the bias </w:t>
+      </w:r>
+      <w:proofErr w:type="gramStart"/>
+      <w:r>
+        <w:t>had.</w:t>
+      </w:r>
+      <w:proofErr w:type="gramEnd"/>
+    </w:p>
+    <w:p>
+      <w:pPr>
+        <w:pStyle w:val="ListParagraph"/>
+        <w:ind w:left="0"/>
+      </w:pPr>
+    </w:p>
+    <w:p>
+      <w:pPr>
+        <w:pStyle w:val="ListParagraph"/>
+        <w:ind w:left="0"/>
+      </w:pPr>
+      <w:r>
+        <w:t>Shot noise measurement</w:t>
+      </w:r>
+      <w:r>
+        <w:t xml:space="preserve"> at 0.6V</w:t>
+      </w:r>
+      <w:r>
+        <w:t>.</w:t>
+      </w:r>
+    </w:p>
+    <w:p>
+      <w:pPr>
+        <w:pStyle w:val="ListParagraph"/>
+        <w:ind w:left="0"/>
+      </w:pPr>
+    </w:p>
+    <w:p>
+      <w:pPr>
+        <w:pStyle w:val="ListParagraph"/>
+        <w:ind w:left="0"/>
+      </w:pPr>
+      <w:r>
+        <w:t>Saturation at 0.6V.</w:t>
+      </w:r>
+    </w:p>
+    <w:p>
+      <w:pPr>
+        <w:pStyle w:val="ListParagraph"/>
+        <w:ind w:left="0"/>
+      </w:pPr>
+    </w:p>
+    <w:p>
+      <w:pPr>
+        <w:pStyle w:val="ListParagraph"/>
+        <w:ind w:left="0"/>
+      </w:pPr>
+      <w:r>
+        <w:t xml:space="preserve">Measurement of ‘absolute </w:t>
+      </w:r>
+      <w:proofErr w:type="spellStart"/>
+      <w:r>
+        <w:t>qe</w:t>
+      </w:r>
+      <w:proofErr w:type="spellEnd"/>
+      <w:r>
+        <w:t>’</w:t>
+      </w:r>
+    </w:p>
+    <w:p>
+      <w:pPr>
+        <w:pStyle w:val="ListParagraph"/>
+        <w:ind w:left="0"/>
+      </w:pPr>
+    </w:p>
+    <w:p>
+      <w:pPr>
+        <w:pStyle w:val="ListParagraph"/>
+        <w:ind w:left="0"/>
+        <w:rPr>
+          <w:u w:val="single"/>
+        </w:rPr>
+      </w:pPr>
+      <w:r>
+        <w:rPr>
+          <w:u w:val="single"/>
+        </w:rPr>
+        <w:t>8.5</w:t>
+      </w:r>
+    </w:p>
+    <w:p>
+      <w:pPr>
+        <w:pStyle w:val="ListParagraph"/>
+        <w:ind w:left="0"/>
+      </w:pPr>
+    </w:p>
+    <w:p>
+      <w:pPr>
+        <w:pStyle w:val="ListParagraph"/>
+        <w:ind w:left="0"/>
+      </w:pPr>
+      <w:r>
+        <w:t>Why dark noise was measured</w:t>
+      </w:r>
+      <w:r>
+        <w:t xml:space="preserve">? To find balance between </w:t>
+      </w:r>
+      <w:proofErr w:type="spellStart"/>
+      <w:r>
+        <w:t>qe</w:t>
+      </w:r>
+      <w:proofErr w:type="spellEnd"/>
+      <w:r>
+        <w:t xml:space="preserve"> and noise</w:t>
+      </w:r>
+      <w:r>
+        <w:t>.</w:t>
+      </w:r>
+      <w:r>
+        <w:t xml:space="preserve"> </w:t>
+      </w:r>
+      <w:proofErr w:type="gramStart"/>
+      <w:r>
+        <w:t>Sign post</w:t>
+      </w:r>
+      <w:proofErr w:type="gramEnd"/>
+      <w:r>
+        <w:t xml:space="preserve"> to QE increase.</w:t>
+      </w:r>
+      <w:r>
+        <w:t xml:space="preserve"> Signpost and repeat of the </w:t>
+      </w:r>
+      <w:proofErr w:type="gramStart"/>
+      <w:r>
+        <w:t>benchmark</w:t>
+      </w:r>
+      <w:proofErr w:type="gramEnd"/>
+    </w:p>
+    <w:p>
+      <w:pPr>
+        <w:pStyle w:val="ListParagraph"/>
+        <w:ind w:left="0"/>
+      </w:pPr>
+    </w:p>
+    <w:p>
+      <w:pPr>
+        <w:pStyle w:val="ListParagraph"/>
+        <w:ind w:left="0"/>
+      </w:pPr>
+      <w:proofErr w:type="gramStart"/>
+      <w:r>
+        <w:t>Method</w:t>
+      </w:r>
+      <w:r>
+        <w:t xml:space="preserve"> </w:t>
+      </w:r>
+      <w:r>
+        <w:t xml:space="preserve"> (</w:t>
+      </w:r>
+      <w:proofErr w:type="gramEnd"/>
+      <w:r>
+        <w:t xml:space="preserve">PD circuit) </w:t>
+      </w:r>
+      <w:r>
+        <w:t>and sign post to results.</w:t>
+      </w:r>
+    </w:p>
+    <w:p>
+      <w:pPr>
+        <w:pStyle w:val="ListParagraph"/>
+        <w:ind w:left="0"/>
+      </w:pPr>
+    </w:p>
+    <w:p>
+      <w:pPr>
+        <w:pStyle w:val="ListParagraph"/>
+        <w:ind w:left="0"/>
+        <w:rPr>
+          <w:u w:val="single"/>
+        </w:rPr>
+      </w:pPr>
+      <w:r>
+        <w:rPr>
+          <w:u w:val="single"/>
+        </w:rPr>
+        <w:t>8.5.1</w:t>
+      </w:r>
+    </w:p>
+    <w:p>
+      <w:pPr>
+        <w:pStyle w:val="ListParagraph"/>
+        <w:ind w:left="0"/>
+      </w:pPr>
+      <w:r>
+        <w:t xml:space="preserve"> </w:t>
+      </w:r>
+    </w:p>
+    <w:p>
+      <w:pPr>
+        <w:pStyle w:val="ListParagraph"/>
+        <w:ind w:left="0"/>
+      </w:pPr>
+      <w:r>
+        <w:t>Results</w:t>
+      </w:r>
+      <w:r>
+        <w:t>.</w:t>
+      </w:r>
+    </w:p>
+    <w:p>
+      <w:pPr>
+        <w:pStyle w:val="ListParagraph"/>
+        <w:ind w:left="0"/>
+      </w:pPr>
+    </w:p>
+    <w:p>
+      <w:pPr>
+        <w:pStyle w:val="ListParagraph"/>
+        <w:ind w:left="0"/>
+      </w:pPr>
+      <w:r>
+        <w:t>Duplicate photodiodes and batch variation</w:t>
+      </w:r>
+    </w:p>
+    <w:p>
+      <w:pPr>
+        <w:pStyle w:val="ListParagraph"/>
+        <w:ind w:left="0"/>
+      </w:pPr>
+    </w:p>
+    <w:p>
+      <w:pPr>
+        <w:pStyle w:val="ListParagraph"/>
+        <w:ind w:left="0"/>
+        <w:rPr>
+          <w:u w:val="single"/>
+        </w:rPr>
+      </w:pPr>
+      <w:r>
+        <w:rPr>
+          <w:u w:val="single"/>
+        </w:rPr>
+        <w:t>8.5.2</w:t>
+      </w:r>
+    </w:p>
+    <w:p>
+      <w:pPr>
+        <w:pStyle w:val="ListParagraph"/>
+        <w:ind w:left="0"/>
+      </w:pPr>
+    </w:p>
+    <w:p>
+      <w:pPr>
+        <w:pStyle w:val="ListParagraph"/>
+        <w:ind w:left="0"/>
+      </w:pPr>
+      <w:r>
+        <w:t>T</w:t>
+      </w:r>
+      <w:r>
+        <w:t>he range of temperatures chosen</w:t>
+      </w:r>
+      <w:r>
+        <w:t xml:space="preserve"> and how the diodes were cooled.</w:t>
+      </w:r>
+    </w:p>
+    <w:p>
+      <w:pPr>
+        <w:pStyle w:val="ListParagraph"/>
+        <w:ind w:left="0"/>
+      </w:pPr>
+    </w:p>
+    <w:p>
+      <w:pPr>
+        <w:pStyle w:val="ListParagraph"/>
+        <w:ind w:left="0"/>
+      </w:pPr>
+      <w:r>
+        <w:t>What the results show.</w:t>
+      </w:r>
+    </w:p>
+    <w:p>
+      <w:pPr>
+        <w:pStyle w:val="ListParagraph"/>
+        <w:ind w:left="0"/>
+      </w:pPr>
+    </w:p>
     <w:p>
       <w:pPr>
         <w:pStyle w:val="ListParagraph"/>
@@ -406,840 +1435,6 @@
           <w:u w:val="single"/>
         </w:rPr>
         <w:lastRenderedPageBreak/>
-        <w:t>Intro bit</w:t>
-      </w:r>
-    </w:p>
-    <w:p>
-      <w:pPr>
-        <w:pStyle w:val="ListParagraph"/>
-        <w:ind w:left="0"/>
-        <w:rPr>
-          <w:u w:val="single"/>
-        </w:rPr>
-      </w:pPr>
-    </w:p>
-    <w:p>
-      <w:pPr>
-        <w:pStyle w:val="ListParagraph"/>
-        <w:ind w:left="0"/>
-      </w:pPr>
-      <w:r>
-        <w:t>Sign post</w:t>
-      </w:r>
-      <w:r>
-        <w:t>s. B</w:t>
-      </w:r>
-      <w:r>
-        <w:t>asic introduction</w:t>
-      </w:r>
-      <w:r>
-        <w:t xml:space="preserve"> of what is important</w:t>
-      </w:r>
-      <w:r>
-        <w:t xml:space="preserve"> and what was done</w:t>
-      </w:r>
-    </w:p>
-    <w:p>
-      <w:pPr>
-        <w:pStyle w:val="ListParagraph"/>
-        <w:ind w:left="0"/>
-      </w:pPr>
-    </w:p>
-    <w:p>
-      <w:pPr>
-        <w:pStyle w:val="ListParagraph"/>
-        <w:ind w:left="0"/>
-        <w:rPr>
-          <w:u w:val="single"/>
-        </w:rPr>
-      </w:pPr>
-      <w:r>
-        <w:rPr>
-          <w:u w:val="single"/>
-        </w:rPr>
-        <w:t>8.1</w:t>
-      </w:r>
-    </w:p>
-    <w:p>
-      <w:pPr>
-        <w:pStyle w:val="ListParagraph"/>
-        <w:ind w:left="0"/>
-      </w:pPr>
-    </w:p>
-    <w:p>
-      <w:pPr>
-        <w:pStyle w:val="ListParagraph"/>
-        <w:ind w:left="0"/>
-      </w:pPr>
-      <w:r>
-        <w:t>QE</w:t>
-      </w:r>
-      <w:r>
-        <w:t xml:space="preserve"> req.</w:t>
-      </w:r>
-    </w:p>
-    <w:p>
-      <w:pPr>
-        <w:pStyle w:val="ListParagraph"/>
-        <w:ind w:left="0"/>
-      </w:pPr>
-    </w:p>
-    <w:p>
-      <w:pPr>
-        <w:pStyle w:val="ListParagraph"/>
-        <w:ind w:left="0"/>
-      </w:pPr>
-      <w:r>
-        <w:t>Light handling req.</w:t>
-      </w:r>
-    </w:p>
-    <w:p>
-      <w:pPr>
-        <w:pStyle w:val="ListParagraph"/>
-        <w:ind w:left="0"/>
-      </w:pPr>
-    </w:p>
-    <w:p>
-      <w:pPr>
-        <w:pStyle w:val="ListParagraph"/>
-        <w:ind w:left="0"/>
-      </w:pPr>
-      <w:r>
-        <w:t>Noise req.</w:t>
-      </w:r>
-    </w:p>
-    <w:p>
-      <w:pPr>
-        <w:pStyle w:val="ListParagraph"/>
-        <w:ind w:left="0"/>
-      </w:pPr>
-    </w:p>
-    <w:p>
-      <w:pPr>
-        <w:pStyle w:val="ListParagraph"/>
-        <w:ind w:left="0"/>
-      </w:pPr>
-      <w:r>
-        <w:t>Discussion of why heterodyne wont work.</w:t>
-      </w:r>
-    </w:p>
-    <w:p>
-      <w:pPr>
-        <w:pStyle w:val="ListParagraph"/>
-        <w:ind w:left="0"/>
-        <w:rPr>
-          <w:u w:val="single"/>
-        </w:rPr>
-      </w:pPr>
-    </w:p>
-    <w:p>
-      <w:pPr>
-        <w:pStyle w:val="ListParagraph"/>
-        <w:ind w:left="0"/>
-        <w:rPr>
-          <w:u w:val="single"/>
-        </w:rPr>
-      </w:pPr>
-      <w:r>
-        <w:rPr>
-          <w:u w:val="single"/>
-        </w:rPr>
-        <w:t>8.2</w:t>
-      </w:r>
-    </w:p>
-    <w:p>
-      <w:pPr>
-        <w:pStyle w:val="ListParagraph"/>
-        <w:ind w:left="0"/>
-        <w:rPr>
-          <w:u w:val="single"/>
-        </w:rPr>
-      </w:pPr>
-    </w:p>
-    <w:p>
-      <w:pPr>
-        <w:pStyle w:val="ListParagraph"/>
-        <w:ind w:left="0"/>
-      </w:pPr>
-      <w:r>
-        <w:t>Sign post</w:t>
-      </w:r>
-      <w:r>
-        <w:t xml:space="preserve"> and basic intro.</w:t>
-      </w:r>
-    </w:p>
-    <w:p>
-      <w:pPr>
-        <w:pStyle w:val="ListParagraph"/>
-        <w:ind w:left="0"/>
-      </w:pPr>
-    </w:p>
-    <w:p>
-      <w:pPr>
-        <w:pStyle w:val="ListParagraph"/>
-        <w:ind w:left="0"/>
-      </w:pPr>
-      <w:r>
-        <w:t>PN diode explanation</w:t>
-      </w:r>
-    </w:p>
-    <w:p>
-      <w:pPr>
-        <w:pStyle w:val="ListParagraph"/>
-        <w:ind w:left="0"/>
-      </w:pPr>
-    </w:p>
-    <w:p>
-      <w:pPr>
-        <w:pStyle w:val="ListParagraph"/>
-        <w:ind w:left="0"/>
-      </w:pPr>
-      <w:r>
-        <w:t xml:space="preserve">Photon </w:t>
-      </w:r>
-      <w:r>
-        <w:t>absorption in diode + depletion region</w:t>
-      </w:r>
-    </w:p>
-    <w:p>
-      <w:pPr>
-        <w:pStyle w:val="ListParagraph"/>
-        <w:ind w:left="0"/>
-      </w:pPr>
-    </w:p>
-    <w:p>
-      <w:pPr>
-        <w:pStyle w:val="ListParagraph"/>
-        <w:ind w:left="0"/>
-      </w:pPr>
-      <w:r>
-        <w:t>Widen depletion region with bias</w:t>
-      </w:r>
-    </w:p>
-    <w:p>
-      <w:pPr>
-        <w:pStyle w:val="ListParagraph"/>
-        <w:ind w:left="0"/>
-      </w:pPr>
-    </w:p>
-    <w:p>
-      <w:pPr>
-        <w:pStyle w:val="ListParagraph"/>
-        <w:ind w:left="0"/>
-      </w:pPr>
-      <w:r>
-        <w:t>Widen depletion region with intrinsic layer</w:t>
-      </w:r>
-    </w:p>
-    <w:p>
-      <w:pPr>
-        <w:pStyle w:val="ListParagraph"/>
-        <w:ind w:left="0"/>
-      </w:pPr>
-    </w:p>
-    <w:p>
-      <w:pPr>
-        <w:pStyle w:val="ListParagraph"/>
-        <w:ind w:left="0"/>
-      </w:pPr>
-      <w:r>
-        <w:t>What ingaas is.</w:t>
-      </w:r>
-    </w:p>
-    <w:p>
-      <w:pPr>
-        <w:pStyle w:val="ListParagraph"/>
-        <w:ind w:left="0"/>
-      </w:pPr>
-    </w:p>
-    <w:p>
-      <w:pPr>
-        <w:pStyle w:val="ListParagraph"/>
-        <w:ind w:left="0"/>
-      </w:pPr>
-      <w:r>
-        <w:t>Making ingaas extended</w:t>
-      </w:r>
-    </w:p>
-    <w:p>
-      <w:pPr>
-        <w:pStyle w:val="ListParagraph"/>
-        <w:ind w:left="0"/>
-      </w:pPr>
-    </w:p>
-    <w:p>
-      <w:pPr>
-        <w:pStyle w:val="ListParagraph"/>
-        <w:ind w:left="0"/>
-      </w:pPr>
-      <w:r>
-        <w:t>Defects in extended InGaAs</w:t>
-      </w:r>
-      <w:r>
-        <w:t xml:space="preserve"> that is thick enough to have good qe.</w:t>
-      </w:r>
-    </w:p>
-    <w:p>
-      <w:pPr>
-        <w:pStyle w:val="ListParagraph"/>
-        <w:ind w:left="0"/>
-      </w:pPr>
-    </w:p>
-    <w:p>
-      <w:pPr>
-        <w:pStyle w:val="ListParagraph"/>
-        <w:ind w:left="0"/>
-      </w:pPr>
-      <w:r>
-        <w:t>Wh</w:t>
-      </w:r>
-      <w:r>
-        <w:t>at is a defect.</w:t>
-      </w:r>
-    </w:p>
-    <w:p>
-      <w:pPr>
-        <w:pStyle w:val="ListParagraph"/>
-        <w:ind w:left="0"/>
-      </w:pPr>
-    </w:p>
-    <w:p>
-      <w:pPr>
-        <w:pStyle w:val="ListParagraph"/>
-        <w:ind w:left="0"/>
-      </w:pPr>
-      <w:r>
-        <w:t>AR coating.</w:t>
-      </w:r>
-    </w:p>
-    <w:p>
-      <w:pPr>
-        <w:pStyle w:val="ListParagraph"/>
-        <w:ind w:left="0"/>
-      </w:pPr>
-    </w:p>
-    <w:p>
-      <w:pPr>
-        <w:pStyle w:val="ListParagraph"/>
-        <w:ind w:left="0"/>
-      </w:pPr>
-      <w:r>
-        <w:t>Dark noise and dark current.</w:t>
-      </w:r>
-    </w:p>
-    <w:p>
-      <w:pPr>
-        <w:pStyle w:val="ListParagraph"/>
-        <w:ind w:left="0"/>
-      </w:pPr>
-    </w:p>
-    <w:p>
-      <w:pPr>
-        <w:pStyle w:val="ListParagraph"/>
-        <w:ind w:left="0"/>
-      </w:pPr>
-      <w:r>
-        <w:t>Noise formula.</w:t>
-      </w:r>
-    </w:p>
-    <w:p>
-      <w:pPr>
-        <w:pStyle w:val="ListParagraph"/>
-        <w:ind w:left="0"/>
-      </w:pPr>
-    </w:p>
-    <w:p>
-      <w:pPr>
-        <w:pStyle w:val="ListParagraph"/>
-        <w:ind w:left="0"/>
-        <w:rPr>
-          <w:u w:val="single"/>
-        </w:rPr>
-      </w:pPr>
-      <w:r>
-        <w:rPr>
-          <w:u w:val="single"/>
-        </w:rPr>
-        <w:t>8.3</w:t>
-      </w:r>
-    </w:p>
-    <w:p>
-      <w:pPr>
-        <w:pStyle w:val="ListParagraph"/>
-        <w:ind w:left="0"/>
-        <w:rPr>
-          <w:u w:val="single"/>
-        </w:rPr>
-      </w:pPr>
-    </w:p>
-    <w:p>
-      <w:pPr>
-        <w:pStyle w:val="ListParagraph"/>
-        <w:ind w:left="0"/>
-      </w:pPr>
-      <w:r>
-        <w:t xml:space="preserve">Dark noise was tested in </w:t>
-      </w:r>
-      <w:r>
-        <w:t>commercially available PDS. (repeated?).</w:t>
-      </w:r>
-      <w:r>
-        <w:t xml:space="preserve"> What was measured in each PD. </w:t>
-      </w:r>
-    </w:p>
-    <w:p>
-      <w:pPr>
-        <w:pStyle w:val="ListParagraph"/>
-        <w:ind w:left="0"/>
-      </w:pPr>
-    </w:p>
-    <w:p>
-      <w:pPr>
-        <w:pStyle w:val="ListParagraph"/>
-        <w:ind w:left="0"/>
-        <w:rPr>
-          <w:u w:val="single"/>
-        </w:rPr>
-      </w:pPr>
-      <w:r>
-        <w:rPr>
-          <w:u w:val="single"/>
-        </w:rPr>
-        <w:t>8.4</w:t>
-      </w:r>
-    </w:p>
-    <w:p>
-      <w:pPr>
-        <w:pStyle w:val="ListParagraph"/>
-        <w:ind w:left="0"/>
-      </w:pPr>
-    </w:p>
-    <w:p>
-      <w:pPr>
-        <w:pStyle w:val="ListParagraph"/>
-        <w:ind w:left="0"/>
-      </w:pPr>
-      <w:r>
-        <w:t>What was</w:t>
-      </w:r>
-      <w:r>
-        <w:t xml:space="preserve"> measured</w:t>
-      </w:r>
-      <w:r>
-        <w:t xml:space="preserve"> + sign posts</w:t>
-      </w:r>
-      <w:r>
-        <w:t xml:space="preserve"> to method and main result.</w:t>
-      </w:r>
-    </w:p>
-    <w:p>
-      <w:pPr>
-        <w:pStyle w:val="ListParagraph"/>
-        <w:ind w:left="0"/>
-      </w:pPr>
-      <w:r>
-        <w:t>8.4.1</w:t>
-      </w:r>
-    </w:p>
-    <w:p>
-      <w:pPr>
-        <w:pStyle w:val="ListParagraph"/>
-        <w:ind w:left="0"/>
-      </w:pPr>
-    </w:p>
-    <w:p>
-      <w:pPr>
-        <w:pStyle w:val="ListParagraph"/>
-        <w:ind w:left="0"/>
-      </w:pPr>
-      <w:r>
-        <w:t>The two measurement styles</w:t>
-      </w:r>
-    </w:p>
-    <w:p>
-      <w:pPr>
-        <w:pStyle w:val="ListParagraph"/>
-        <w:ind w:left="0"/>
-      </w:pPr>
-    </w:p>
-    <w:p>
-      <w:pPr>
-        <w:pStyle w:val="ListParagraph"/>
-        <w:ind w:left="0"/>
-      </w:pPr>
-      <w:r>
-        <w:t>Why shot noise needs to be measured</w:t>
-      </w:r>
-      <w:r>
-        <w:t>, and what you need to do this.</w:t>
-      </w:r>
-    </w:p>
-    <w:p>
-      <w:pPr>
-        <w:pStyle w:val="ListParagraph"/>
-        <w:ind w:left="0"/>
-      </w:pPr>
-    </w:p>
-    <w:p>
-      <w:pPr>
-        <w:pStyle w:val="ListParagraph"/>
-        <w:ind w:left="0"/>
-      </w:pPr>
-      <w:r>
-        <w:t>TIA description</w:t>
-      </w:r>
-    </w:p>
-    <w:p>
-      <w:pPr>
-        <w:pStyle w:val="ListParagraph"/>
-        <w:ind w:left="0"/>
-      </w:pPr>
-    </w:p>
-    <w:p>
-      <w:pPr>
-        <w:pStyle w:val="ListParagraph"/>
-        <w:ind w:left="0"/>
-      </w:pPr>
-      <w:r>
-        <w:t>optics and laser description</w:t>
-      </w:r>
-    </w:p>
-    <w:p>
-      <w:pPr>
-        <w:pStyle w:val="ListParagraph"/>
-        <w:ind w:left="0"/>
-      </w:pPr>
-    </w:p>
-    <w:p>
-      <w:pPr>
-        <w:pStyle w:val="ListParagraph"/>
-        <w:ind w:left="0"/>
-      </w:pPr>
-      <w:r>
-        <w:t>Beam parameter description</w:t>
-      </w:r>
-    </w:p>
-    <w:p>
-      <w:pPr>
-        <w:pStyle w:val="ListParagraph"/>
-        <w:ind w:left="0"/>
-      </w:pPr>
-    </w:p>
-    <w:p>
-      <w:pPr>
-        <w:pStyle w:val="ListParagraph"/>
-        <w:ind w:left="0"/>
-      </w:pPr>
-      <w:r>
-        <w:t xml:space="preserve">How </w:t>
-      </w:r>
-      <w:r>
-        <w:t>the noise was measured.</w:t>
-      </w:r>
-    </w:p>
-    <w:p>
-      <w:pPr>
-        <w:pStyle w:val="ListParagraph"/>
-        <w:ind w:left="0"/>
-      </w:pPr>
-    </w:p>
-    <w:p>
-      <w:pPr>
-        <w:pStyle w:val="ListParagraph"/>
-        <w:ind w:left="0"/>
-      </w:pPr>
-      <w:r>
-        <w:t>Calibration of measurements with 1111</w:t>
-      </w:r>
-      <w:r>
-        <w:t xml:space="preserve"> kHz peak.</w:t>
-      </w:r>
-    </w:p>
-    <w:p>
-      <w:pPr>
-        <w:pStyle w:val="ListParagraph"/>
-        <w:ind w:left="0"/>
-      </w:pPr>
-    </w:p>
-    <w:p>
-      <w:pPr>
-        <w:pStyle w:val="ListParagraph"/>
-        <w:ind w:left="0"/>
-        <w:rPr>
-          <w:u w:val="single"/>
-        </w:rPr>
-      </w:pPr>
-      <w:r>
-        <w:rPr>
-          <w:u w:val="single"/>
-        </w:rPr>
-        <w:t>8.4.2</w:t>
-      </w:r>
-    </w:p>
-    <w:p>
-      <w:pPr>
-        <w:pStyle w:val="ListParagraph"/>
-        <w:ind w:left="0"/>
-      </w:pPr>
-      <w:r>
-        <w:t>What effect increasing the bias had.</w:t>
-      </w:r>
-    </w:p>
-    <w:p>
-      <w:pPr>
-        <w:pStyle w:val="ListParagraph"/>
-        <w:ind w:left="0"/>
-      </w:pPr>
-    </w:p>
-    <w:p>
-      <w:pPr>
-        <w:pStyle w:val="ListParagraph"/>
-        <w:ind w:left="0"/>
-      </w:pPr>
-      <w:r>
-        <w:t>Shot noise measurement</w:t>
-      </w:r>
-      <w:r>
-        <w:t xml:space="preserve"> at 0.6V</w:t>
-      </w:r>
-      <w:r>
-        <w:t>.</w:t>
-      </w:r>
-    </w:p>
-    <w:p>
-      <w:pPr>
-        <w:pStyle w:val="ListParagraph"/>
-        <w:ind w:left="0"/>
-      </w:pPr>
-    </w:p>
-    <w:p>
-      <w:pPr>
-        <w:pStyle w:val="ListParagraph"/>
-        <w:ind w:left="0"/>
-      </w:pPr>
-      <w:r>
-        <w:t>Saturation at 0.6V.</w:t>
-      </w:r>
-    </w:p>
-    <w:p>
-      <w:pPr>
-        <w:pStyle w:val="ListParagraph"/>
-        <w:ind w:left="0"/>
-      </w:pPr>
-    </w:p>
-    <w:p>
-      <w:pPr>
-        <w:pStyle w:val="ListParagraph"/>
-        <w:ind w:left="0"/>
-      </w:pPr>
-      <w:r>
-        <w:t>Measurement of ‘absolute qe’</w:t>
-      </w:r>
-    </w:p>
-    <w:p>
-      <w:pPr>
-        <w:pStyle w:val="ListParagraph"/>
-        <w:ind w:left="0"/>
-      </w:pPr>
-    </w:p>
-    <w:p>
-      <w:pPr>
-        <w:pStyle w:val="ListParagraph"/>
-        <w:ind w:left="0"/>
-        <w:rPr>
-          <w:u w:val="single"/>
-        </w:rPr>
-      </w:pPr>
-      <w:r>
-        <w:rPr>
-          <w:u w:val="single"/>
-        </w:rPr>
-        <w:t>8.5</w:t>
-      </w:r>
-    </w:p>
-    <w:p>
-      <w:pPr>
-        <w:pStyle w:val="ListParagraph"/>
-        <w:ind w:left="0"/>
-      </w:pPr>
-    </w:p>
-    <w:p>
-      <w:pPr>
-        <w:pStyle w:val="ListParagraph"/>
-        <w:ind w:left="0"/>
-      </w:pPr>
-      <w:r>
-        <w:t>Why dark noise was measured</w:t>
-      </w:r>
-      <w:r>
-        <w:t>? To find balance between qe and noise</w:t>
-      </w:r>
-      <w:r>
-        <w:t>.</w:t>
-      </w:r>
-      <w:r>
-        <w:t xml:space="preserve"> Sign post to QE increase.</w:t>
-      </w:r>
-      <w:r>
-        <w:t xml:space="preserve"> Signpost and repeat of the benchmark</w:t>
-      </w:r>
-    </w:p>
-    <w:p>
-      <w:pPr>
-        <w:pStyle w:val="ListParagraph"/>
-        <w:ind w:left="0"/>
-      </w:pPr>
-    </w:p>
-    <w:p>
-      <w:pPr>
-        <w:pStyle w:val="ListParagraph"/>
-        <w:ind w:left="0"/>
-      </w:pPr>
-      <w:r>
-        <w:t>Method</w:t>
-      </w:r>
-      <w:r>
-        <w:t xml:space="preserve"> </w:t>
-      </w:r>
-      <w:r>
-        <w:t xml:space="preserve"> (PD circuit) </w:t>
-      </w:r>
-      <w:r>
-        <w:t>and sign post to results.</w:t>
-      </w:r>
-    </w:p>
-    <w:p>
-      <w:pPr>
-        <w:pStyle w:val="ListParagraph"/>
-        <w:ind w:left="0"/>
-      </w:pPr>
-    </w:p>
-    <w:p>
-      <w:pPr>
-        <w:pStyle w:val="ListParagraph"/>
-        <w:ind w:left="0"/>
-        <w:rPr>
-          <w:u w:val="single"/>
-        </w:rPr>
-      </w:pPr>
-      <w:r>
-        <w:rPr>
-          <w:u w:val="single"/>
-        </w:rPr>
-        <w:t>8.5.1</w:t>
-      </w:r>
-    </w:p>
-    <w:p>
-      <w:pPr>
-        <w:pStyle w:val="ListParagraph"/>
-        <w:ind w:left="0"/>
-      </w:pPr>
-      <w:r>
-        <w:t xml:space="preserve"> </w:t>
-      </w:r>
-    </w:p>
-    <w:p>
-      <w:pPr>
-        <w:pStyle w:val="ListParagraph"/>
-        <w:ind w:left="0"/>
-      </w:pPr>
-      <w:r>
-        <w:t>Results</w:t>
-      </w:r>
-      <w:r>
-        <w:t>.</w:t>
-      </w:r>
-    </w:p>
-    <w:p>
-      <w:pPr>
-        <w:pStyle w:val="ListParagraph"/>
-        <w:ind w:left="0"/>
-      </w:pPr>
-    </w:p>
-    <w:p>
-      <w:pPr>
-        <w:pStyle w:val="ListParagraph"/>
-        <w:ind w:left="0"/>
-      </w:pPr>
-      <w:r>
-        <w:t>Duplicate photodiodes and batch variation</w:t>
-      </w:r>
-    </w:p>
-    <w:p>
-      <w:pPr>
-        <w:pStyle w:val="ListParagraph"/>
-        <w:ind w:left="0"/>
-      </w:pPr>
-    </w:p>
-    <w:p>
-      <w:pPr>
-        <w:pStyle w:val="ListParagraph"/>
-        <w:ind w:left="0"/>
-        <w:rPr>
-          <w:u w:val="single"/>
-        </w:rPr>
-      </w:pPr>
-      <w:r>
-        <w:rPr>
-          <w:u w:val="single"/>
-        </w:rPr>
-        <w:t>8.5.2</w:t>
-      </w:r>
-    </w:p>
-    <w:p>
-      <w:pPr>
-        <w:pStyle w:val="ListParagraph"/>
-        <w:ind w:left="0"/>
-      </w:pPr>
-    </w:p>
-    <w:p>
-      <w:pPr>
-        <w:pStyle w:val="ListParagraph"/>
-        <w:ind w:left="0"/>
-      </w:pPr>
-      <w:r>
-        <w:t>T</w:t>
-      </w:r>
-      <w:r>
-        <w:t>he range of temperatures chosen</w:t>
-      </w:r>
-      <w:r>
-        <w:t xml:space="preserve"> and how the diodes were cooled.</w:t>
-      </w:r>
-    </w:p>
-    <w:p>
-      <w:pPr>
-        <w:pStyle w:val="ListParagraph"/>
-        <w:ind w:left="0"/>
-      </w:pPr>
-    </w:p>
-    <w:p>
-      <w:pPr>
-        <w:pStyle w:val="ListParagraph"/>
-        <w:ind w:left="0"/>
-      </w:pPr>
-      <w:r>
-        <w:t>What the results show.</w:t>
-      </w:r>
-    </w:p>
-    <w:p>
-      <w:pPr>
-        <w:pStyle w:val="ListParagraph"/>
-        <w:ind w:left="0"/>
-      </w:pPr>
-    </w:p>
-    <w:p>
-      <w:pPr>
-        <w:pStyle w:val="ListParagraph"/>
-        <w:ind w:left="0"/>
-        <w:rPr>
-          <w:u w:val="single"/>
-        </w:rPr>
-      </w:pPr>
-      <w:r>
-        <w:rPr>
-          <w:u w:val="single"/>
-        </w:rPr>
         <w:t>8.6</w:t>
       </w:r>
     </w:p>
@@ -1263,17 +1458,29 @@
     </w:p>
     <w:p>
       <w:r>
-        <w:lastRenderedPageBreak/>
         <w:t>IG24 exceeds shot noise by x2</w:t>
       </w:r>
       <w:r>
-        <w:t>. Sign post to method.</w:t>
-      </w:r>
-    </w:p>
-    <w:p>
-      <w:r>
-        <w:t>Noise projection to rule out bias noise</w:t>
-      </w:r>
+        <w:t xml:space="preserve">. </w:t>
+      </w:r>
+      <w:proofErr w:type="gramStart"/>
+      <w:r>
+        <w:t>Sign post</w:t>
+      </w:r>
+      <w:proofErr w:type="gramEnd"/>
+      <w:r>
+        <w:t xml:space="preserve"> to method.</w:t>
+      </w:r>
+    </w:p>
+    <w:p>
+      <w:r>
+        <w:t xml:space="preserve">Noise projection to rule out bias </w:t>
+      </w:r>
+      <w:proofErr w:type="gramStart"/>
+      <w:r>
+        <w:t>noise</w:t>
+      </w:r>
+      <w:proofErr w:type="gramEnd"/>
     </w:p>
     <w:p>
       <w:r>
@@ -1282,7 +1489,15 @@
     </w:p>
     <w:p>
       <w:r>
-        <w:t>Result: no idea whats going on.</w:t>
+        <w:t xml:space="preserve">Result: no idea </w:t>
+      </w:r>
+      <w:proofErr w:type="spellStart"/>
+      <w:r>
+        <w:t>whats</w:t>
+      </w:r>
+      <w:proofErr w:type="spellEnd"/>
+      <w:r>
+        <w:t xml:space="preserve"> going on.</w:t>
       </w:r>
     </w:p>
     <w:p>
@@ -1299,8 +1514,13 @@
       </w:r>
     </w:p>
     <w:p>
-      <w:r>
-        <w:t>InSb intro. What was measured.</w:t>
+      <w:proofErr w:type="spellStart"/>
+      <w:r>
+        <w:t>InSb</w:t>
+      </w:r>
+      <w:proofErr w:type="spellEnd"/>
+      <w:r>
+        <w:t xml:space="preserve"> intro. What was measured.</w:t>
       </w:r>
     </w:p>
     <w:p>
@@ -1331,7 +1551,15 @@
         <w:t>R</w:t>
       </w:r>
       <w:r>
-        <w:t>epeat of information about low qe. Say that the data found supports this.</w:t>
+        <w:t xml:space="preserve">epeat of information about low </w:t>
+      </w:r>
+      <w:proofErr w:type="spellStart"/>
+      <w:r>
+        <w:t>qe</w:t>
+      </w:r>
+      <w:proofErr w:type="spellEnd"/>
+      <w:r>
+        <w:t>. Say that the data found supports this.</w:t>
       </w:r>
     </w:p>
     <w:p>
@@ -1347,7 +1575,15 @@
         <w:t>Repetition of result of QE</w:t>
       </w:r>
       <w:r>
-        <w:t>, discussion of why qe improves.</w:t>
+        <w:t xml:space="preserve">, discussion of why </w:t>
+      </w:r>
+      <w:proofErr w:type="spellStart"/>
+      <w:r>
+        <w:t>qe</w:t>
+      </w:r>
+      <w:proofErr w:type="spellEnd"/>
+      <w:r>
+        <w:t xml:space="preserve"> improves.</w:t>
       </w:r>
     </w:p>
     <w:p>
@@ -1355,7 +1591,15 @@
         <w:t>Repetition of Laser components result</w:t>
       </w:r>
       <w:r>
-        <w:t xml:space="preserve">, discuss possible ways </w:t>
+        <w:t xml:space="preserve">, discuss </w:t>
+      </w:r>
+      <w:proofErr w:type="gramStart"/>
+      <w:r>
+        <w:t>possible ways</w:t>
+      </w:r>
+      <w:proofErr w:type="gramEnd"/>
+      <w:r>
+        <w:t xml:space="preserve"> </w:t>
       </w:r>
       <w:r>
         <w:t>to avoid low power handling.</w:t>

</xml_diff>